<commit_message>
docs(report): refresh technical research report and fix source link
- Replace the stale Google Docs share link (drivesdk URL) in the research-report section with the current public sharing link.

- Update the compiled Project_Solva_Technical_Research_Report.docx binary with the latest revision of the document.

Keeps the README research-report section pointing at the version of the document that is actually distributed with the repository.
</commit_message>
<xml_diff>
--- a/Project_Solva_Technical_Research_Report.docx
+++ b/Project_Solva_Technical_Research_Report.docx
@@ -40,7 +40,7 @@
         <w:rPr>
           <w:rtl w:val="0"/>
         </w:rPr>
-        <w:t xml:space="preserve">PROJECT SOLVA: AI-Assisted Data Observability &amp; Auto-Healing Pipeline</w:t>
+        <w:t xml:space="preserve">PROJECT SOLVA: An AI-Assisted Data Observability and Autonomous Remediation Pipeline Framework</w:t>
       </w:r>
     </w:p>
     <w:p>
@@ -68,8 +68,28 @@
         <w:rPr>
           <w:rtl w:val="0"/>
         </w:rPr>
-        <w:t xml:space="preserve"> Aryan Vishwakarma (The Architect) </w:t>
-      </w:r>
+        <w:t xml:space="preserve"> Aryan Vishwakarma (</w:t>
+      </w:r>
+      <w:r>
+        <w:rPr>
+          <w:rtl w:val="0"/>
+        </w:rPr>
+        <w:t xml:space="preserve">System Architect) </w:t>
+      </w:r>
+    </w:p>
+    <w:p>
+      <w:pPr>
+        <w:pBdr>
+          <w:top w:space="0" w:sz="0" w:val="nil"/>
+          <w:left w:space="0" w:sz="0" w:val="nil"/>
+          <w:bottom w:space="0" w:sz="0" w:val="nil"/>
+          <w:right w:space="0" w:sz="0" w:val="nil"/>
+          <w:between w:space="0" w:sz="0" w:val="nil"/>
+        </w:pBdr>
+        <w:shd w:fill="auto" w:val="clear"/>
+        <w:spacing w:after="225" w:lineRule="auto"/>
+        <w:rPr/>
+      </w:pPr>
       <w:r>
         <w:rPr>
           <w:b w:val="1"/>
@@ -82,7 +102,27 @@
         <w:rPr>
           <w:rtl w:val="0"/>
         </w:rPr>
-        <w:t xml:space="preserve"> March 2026 </w:t>
+        <w:t xml:space="preserve"> September 2026</w:t>
+      </w:r>
+    </w:p>
+    <w:p>
+      <w:pPr>
+        <w:pBdr>
+          <w:top w:space="0" w:sz="0" w:val="nil"/>
+          <w:left w:space="0" w:sz="0" w:val="nil"/>
+          <w:bottom w:space="0" w:sz="0" w:val="nil"/>
+          <w:right w:space="0" w:sz="0" w:val="nil"/>
+          <w:between w:space="0" w:sz="0" w:val="nil"/>
+        </w:pBdr>
+        <w:shd w:fill="auto" w:val="clear"/>
+        <w:spacing w:after="225" w:lineRule="auto"/>
+        <w:rPr/>
+      </w:pPr>
+      <w:r>
+        <w:rPr>
+          <w:rtl w:val="0"/>
+        </w:rPr>
+        <w:t xml:space="preserve"> </w:t>
       </w:r>
       <w:r>
         <w:rPr>
@@ -96,8 +136,22 @@
         <w:rPr>
           <w:rtl w:val="0"/>
         </w:rPr>
-        <w:t xml:space="preserve"> Data Engineering, MLOps, Enterprise Security </w:t>
-      </w:r>
+        <w:t xml:space="preserve"> Data Engineering, MLOps, Enterprise Information Security </w:t>
+      </w:r>
+    </w:p>
+    <w:p>
+      <w:pPr>
+        <w:pBdr>
+          <w:top w:space="0" w:sz="0" w:val="nil"/>
+          <w:left w:space="0" w:sz="0" w:val="nil"/>
+          <w:bottom w:space="0" w:sz="0" w:val="nil"/>
+          <w:right w:space="0" w:sz="0" w:val="nil"/>
+          <w:between w:space="0" w:sz="0" w:val="nil"/>
+        </w:pBdr>
+        <w:shd w:fill="auto" w:val="clear"/>
+        <w:spacing w:after="225" w:lineRule="auto"/>
+        <w:rPr/>
+      </w:pPr>
       <w:r>
         <w:rPr>
           <w:b w:val="1"/>
@@ -110,7 +164,12 @@
         <w:rPr>
           <w:rtl w:val="0"/>
         </w:rPr>
-        <w:t xml:space="preserve"> MVP Architecture Lock</w:t>
+        <w:t xml:space="preserve"> MVP Architectural Specification</w:t>
+      </w:r>
+      <w:r>
+        <w:rPr>
+          <w:rtl w:val="0"/>
+        </w:rPr>
       </w:r>
     </w:p>
     <w:p>
@@ -151,7 +210,7 @@
         <w:ind w:left="600" w:hanging="360"/>
         <w:rPr/>
       </w:pPr>
-      <w:hyperlink r:id="rId6">
+      <w:hyperlink r:id="rId7">
         <w:r>
           <w:rPr>
             <w:color w:val="0000ee"/>
@@ -184,7 +243,7 @@
         <w:ind w:left="600" w:hanging="360"/>
         <w:rPr/>
       </w:pPr>
-      <w:hyperlink r:id="rId7">
+      <w:hyperlink r:id="rId8">
         <w:r>
           <w:rPr>
             <w:color w:val="0000ee"/>
@@ -217,7 +276,7 @@
         <w:ind w:left="600" w:hanging="360"/>
         <w:rPr/>
       </w:pPr>
-      <w:hyperlink r:id="rId8">
+      <w:hyperlink r:id="rId9">
         <w:r>
           <w:rPr>
             <w:color w:val="0000ee"/>
@@ -250,7 +309,7 @@
         <w:ind w:left="600" w:hanging="360"/>
         <w:rPr/>
       </w:pPr>
-      <w:hyperlink r:id="rId9">
+      <w:hyperlink r:id="rId10">
         <w:r>
           <w:rPr>
             <w:color w:val="0000ee"/>
@@ -283,7 +342,7 @@
         <w:ind w:left="600" w:hanging="360"/>
         <w:rPr/>
       </w:pPr>
-      <w:hyperlink r:id="rId10">
+      <w:hyperlink r:id="rId11">
         <w:r>
           <w:rPr>
             <w:color w:val="0000ee"/>
@@ -316,7 +375,7 @@
         <w:ind w:left="600" w:hanging="360"/>
         <w:rPr/>
       </w:pPr>
-      <w:hyperlink r:id="rId11">
+      <w:hyperlink r:id="rId12">
         <w:r>
           <w:rPr>
             <w:color w:val="0000ee"/>
@@ -349,7 +408,7 @@
         <w:ind w:left="600" w:hanging="360"/>
         <w:rPr/>
       </w:pPr>
-      <w:hyperlink r:id="rId12">
+      <w:hyperlink r:id="rId13">
         <w:r>
           <w:rPr>
             <w:color w:val="0000ee"/>
@@ -382,7 +441,7 @@
         <w:ind w:left="600" w:hanging="360"/>
         <w:rPr/>
       </w:pPr>
-      <w:hyperlink r:id="rId13">
+      <w:hyperlink r:id="rId14">
         <w:r>
           <w:rPr>
             <w:color w:val="0000ee"/>
@@ -415,7 +474,7 @@
         <w:ind w:left="600" w:hanging="360"/>
         <w:rPr/>
       </w:pPr>
-      <w:hyperlink r:id="rId14">
+      <w:hyperlink r:id="rId15">
         <w:r>
           <w:rPr>
             <w:color w:val="0000ee"/>
@@ -448,7 +507,7 @@
         <w:ind w:left="600" w:hanging="360"/>
         <w:rPr/>
       </w:pPr>
-      <w:hyperlink r:id="rId15">
+      <w:hyperlink r:id="rId16">
         <w:r>
           <w:rPr>
             <w:color w:val="0000ee"/>
@@ -500,7 +559,19 @@
         <w:rPr>
           <w:rtl w:val="0"/>
         </w:rPr>
-        <w:t xml:space="preserve">In the era of Big Data, the migration of records from legacy databases to modern cloud data warehouses (e.g., Snowflake, BigQuery) is a critical B2B operation. However, traditional ETL (Extract, Transform, Load) pipelines like Fivetran or Airbyte act as "dumb pipes." They transport data but lack the semantic understanding to validate it. When schema drift or high-cardinality data anomalies occur (e.g., incorrect date formats, corrupted strings), the pipeline either crashes or propagates bad data, forcing Data Engineers to write brittle, manual SQL scripts.</w:t>
+        <w:t xml:space="preserve">In </w:t>
+      </w:r>
+      <w:r>
+        <w:rPr>
+          <w:rtl w:val="0"/>
+        </w:rPr>
+        <w:t xml:space="preserve">contemporary large-scale data engineering, the migration of heterogeneous records from legacy database systems to cloud-native data warehouses (e.g., Snowflake, BigQuery) represents an essential operational requirement. However, conventional Extract, Transform, Load (ETL) pipelines, such as those implemented via Fivetran or Airbyte, function strictly as pass-through transport mechanisms. These systems lack semantic evaluation capabilities, rendering them incapable of verifying record integrity. Consequently, when schema drift or high-cardinality data anomalies emerge (e.g., non-standard temporal formats or corrupted string representations), the pipeline either experiences fatal execution failures or propagates non-compliant data downstream, necessitating manual, ad-hoc remediation via engineering intervention</w:t>
+      </w:r>
+      <w:r>
+        <w:rPr>
+          <w:rtl w:val="0"/>
+        </w:rPr>
+        <w:t xml:space="preserve">.</w:t>
       </w:r>
     </w:p>
     <w:p>
@@ -528,7 +599,165 @@
         <w:rPr>
           <w:rtl w:val="0"/>
         </w:rPr>
-        <w:t xml:space="preserve"> introduces a paradigm shift: a 100% air-gapped, decoupled, AI-assisted observability layer. Instead of sending sensitive enterprise data to expensive Cloud LLMs (violating GDPR/HIPAA), Solva utilizes local Small Language Models (SLMs) combined with Vector DB semantic clustering. The system intercepts anomalies, automatically generates deterministic execution code to fix them, and safely stages the data with zero-data-loss guarantees.</w:t>
+        <w:t xml:space="preserve"> </w:t>
+      </w:r>
+      <w:r>
+        <w:rPr>
+          <w:rtl w:val="0"/>
+        </w:rPr>
+        <w:t xml:space="preserve">presents an architectural framework centered on a 100% air-gapped, decoupled, AI-assisted observability layer. Rather than transmitting sensitive enterprise data to external, proprietary Large Language Model (LLM) APIs—which presents significant regulatory compliance risks under GDPR and HIPAA—Solva utilizes localized Small Language Models (SLMs) in conjunction with vector database-driven semantic clustering. The system systematically isolates anomalous data, generates deterministic transformation code for error mitigation, and stages sanitized data while maintaining</w:t>
+      </w:r>
+      <w:r>
+        <w:rPr>
+          <w:rtl w:val="0"/>
+        </w:rPr>
+        <w:t xml:space="preserve"> zero-data-loss guarantees.</w:t>
+      </w:r>
+    </w:p>
+    <w:p>
+      <w:pPr>
+        <w:pStyle w:val="Heading2"/>
+        <w:spacing w:before="0" w:lineRule="auto"/>
+        <w:rPr/>
+      </w:pPr>
+      <w:bookmarkStart w:colFirst="0" w:colLast="0" w:name="_heading=h.iov7op4wd7y8" w:id="0"/>
+      <w:bookmarkEnd w:id="0"/>
+      <w:r>
+        <w:rPr>
+          <w:rtl w:val="0"/>
+        </w:rPr>
+        <w:t xml:space="preserve">2. PROBLEM STATEMENT: Structural Vulnerabilities in Modern Data Pipelines</w:t>
+      </w:r>
+    </w:p>
+    <w:p>
+      <w:pPr>
+        <w:pBdr>
+          <w:top w:space="0" w:sz="0" w:val="nil"/>
+          <w:left w:space="0" w:sz="0" w:val="nil"/>
+          <w:bottom w:space="0" w:sz="0" w:val="nil"/>
+          <w:right w:space="0" w:sz="0" w:val="nil"/>
+          <w:between w:space="0" w:sz="0" w:val="nil"/>
+        </w:pBdr>
+        <w:shd w:fill="auto" w:val="clear"/>
+        <w:rPr/>
+      </w:pPr>
+      <w:r>
+        <w:rPr>
+          <w:rtl w:val="0"/>
+        </w:rPr>
+        <w:t xml:space="preserve">Contemporary data integration architectures exhibit four primary operational limitations</w:t>
+      </w:r>
+      <w:r>
+        <w:rPr>
+          <w:rtl w:val="0"/>
+        </w:rPr>
+        <w:t xml:space="preserve">:</w:t>
+      </w:r>
+    </w:p>
+    <w:p>
+      <w:pPr>
+        <w:numPr>
+          <w:ilvl w:val="0"/>
+          <w:numId w:val="6"/>
+        </w:numPr>
+        <w:ind w:left="600" w:hanging="360"/>
+      </w:pPr>
+      <w:r>
+        <w:rPr>
+          <w:b w:val="1"/>
+          <w:bCs w:val="1"/>
+          <w:rtl w:val="0"/>
+        </w:rPr>
+        <w:t xml:space="preserve">Manual Maintenance Overhead:</w:t>
+      </w:r>
+      <w:r>
+        <w:rPr>
+          <w:rtl w:val="0"/>
+        </w:rPr>
+        <w:t xml:space="preserve"> Data quality validation relies heavily on static regular expressions or hardcoded SQL constraints. Novel anomaly patterns mandate manual engineering cycles to construct bespoke parsing logic.</w:t>
+      </w:r>
+    </w:p>
+    <w:p>
+      <w:pPr>
+        <w:numPr>
+          <w:ilvl w:val="0"/>
+          <w:numId w:val="6"/>
+        </w:numPr>
+        <w:ind w:left="600" w:hanging="360"/>
+      </w:pPr>
+      <w:r>
+        <w:rPr>
+          <w:b w:val="1"/>
+          <w:bCs w:val="1"/>
+          <w:rtl w:val="0"/>
+        </w:rPr>
+        <w:t xml:space="preserve">LLM Throughput Constraints:</w:t>
+      </w:r>
+      <w:r>
+        <w:rPr>
+          <w:rtl w:val="0"/>
+        </w:rPr>
+        <w:t xml:space="preserve"> Processing high-volume anomalous datasets (e.g., 100,000 records) individually through cloud-hosted LLMs using standard Retrieval-Augmented Generation (RAG) is computationally prohibitive, causing severe latency degradation, rate-limiting failures, and out-of-memory (OOM) exceptions.</w:t>
+      </w:r>
+    </w:p>
+    <w:p>
+      <w:pPr>
+        <w:numPr>
+          <w:ilvl w:val="0"/>
+          <w:numId w:val="6"/>
+        </w:numPr>
+        <w:ind w:left="600" w:hanging="360"/>
+      </w:pPr>
+      <w:r>
+        <w:rPr>
+          <w:b w:val="1"/>
+          <w:bCs w:val="1"/>
+          <w:rtl w:val="0"/>
+        </w:rPr>
+        <w:t xml:space="preserve">Data Sovereignty and Privacy Constraints:</w:t>
+      </w:r>
+      <w:r>
+        <w:rPr>
+          <w:rtl w:val="0"/>
+        </w:rPr>
+        <w:t xml:space="preserve"> Transmitting Personally Identifiable Information (PII) or protected health information across enterprise boundaries to public API endpoints constitutes a critical compliance violation for enterprise operations.</w:t>
+      </w:r>
+    </w:p>
+    <w:p>
+      <w:pPr>
+        <w:numPr>
+          <w:ilvl w:val="0"/>
+          <w:numId w:val="6"/>
+        </w:numPr>
+        <w:pBdr>
+          <w:top w:space="0" w:sz="0" w:val="nil"/>
+          <w:left w:space="0" w:sz="0" w:val="nil"/>
+          <w:bottom w:space="0" w:sz="0" w:val="nil"/>
+          <w:right w:space="0" w:sz="0" w:val="nil"/>
+          <w:between w:space="0" w:sz="0" w:val="nil"/>
+        </w:pBdr>
+        <w:shd w:fill="auto" w:val="clear"/>
+        <w:ind w:left="600" w:hanging="360"/>
+        <w:rPr/>
+      </w:pPr>
+      <w:r>
+        <w:rPr>
+          <w:b w:val="1"/>
+          <w:bCs w:val="1"/>
+          <w:rtl w:val="0"/>
+        </w:rPr>
+        <w:t xml:space="preserve">Data Corruption and False Positive Rates:</w:t>
+      </w:r>
+      <w:r>
+        <w:rPr>
+          <w:rtl w:val="0"/>
+        </w:rPr>
+        <w:t xml:space="preserve"> Automated remediation systems frequently misclassify input records, erroneously merging distinct entities or dropping malformed records without generating necessary audit traces.</w:t>
+      </w:r>
+      <w:r>
+        <w:rPr>
+          <w:rtl w:val="0"/>
+        </w:rPr>
       </w:r>
     </w:p>
     <w:p>
@@ -542,14 +771,13 @@
           <w:between w:space="0" w:sz="0" w:val="nil"/>
         </w:pBdr>
         <w:shd w:fill="auto" w:val="clear"/>
-        <w:spacing w:before="0" w:lineRule="auto"/>
-        <w:rPr/>
-      </w:pPr>
-      <w:r>
-        <w:rPr>
-          <w:rtl w:val="0"/>
-        </w:rPr>
-        <w:t xml:space="preserve">2. PROBLEM STATEMENT: The Fragility of Modern ETL</w:t>
+        <w:rPr/>
+      </w:pPr>
+      <w:r>
+        <w:rPr>
+          <w:rtl w:val="0"/>
+        </w:rPr>
+        <w:t xml:space="preserve">3. PROPOSED ARCHITECTURE OVERVIEW</w:t>
       </w:r>
     </w:p>
     <w:p>
@@ -568,7 +796,1340 @@
         <w:rPr>
           <w:rtl w:val="0"/>
         </w:rPr>
-        <w:t xml:space="preserve">The current data engineering landscape faces four critical bottlenecks:</w:t>
+        <w:t xml:space="preserve">To </w:t>
+      </w:r>
+      <w:r>
+        <w:rPr>
+          <w:rtl w:val="0"/>
+        </w:rPr>
+        <w:t xml:space="preserve">address these systemic vulnerabilities, Project Solva incorporates a </w:t>
+      </w:r>
+      <w:r>
+        <w:rPr>
+          <w:b w:val="1"/>
+          <w:bCs w:val="1"/>
+          <w:rtl w:val="0"/>
+        </w:rPr>
+        <w:t xml:space="preserve">Multi-Tier Hybrid Routing Architecture</w:t>
+      </w:r>
+      <w:r>
+        <w:rPr>
+          <w:rtl w:val="0"/>
+        </w:rPr>
+        <w:t xml:space="preserve">. The system operates on the design principle that primary data volumes (approx. 99%) meet basic structural specifications and must proceed via optimized execution pathways, whereas the residual anomalous subset requiring processing is decoupled for</w:t>
+      </w:r>
+      <w:r>
+        <w:rPr>
+          <w:rtl w:val="0"/>
+        </w:rPr>
+        <w:t xml:space="preserve"> asynchronous remediation.</w:t>
+      </w:r>
+    </w:p>
+    <w:p>
+      <w:pPr>
+        <w:pBdr>
+          <w:top w:space="0" w:sz="0" w:val="nil"/>
+          <w:left w:space="0" w:sz="0" w:val="nil"/>
+          <w:bottom w:space="0" w:sz="0" w:val="nil"/>
+          <w:right w:space="0" w:sz="0" w:val="nil"/>
+          <w:between w:space="0" w:sz="0" w:val="nil"/>
+        </w:pBdr>
+        <w:shd w:fill="auto" w:val="clear"/>
+        <w:rPr>
+          <w:b w:val="1"/>
+          <w:bCs w:val="1"/>
+        </w:rPr>
+      </w:pPr>
+      <w:r>
+        <w:rPr>
+          <w:b w:val="1"/>
+          <w:bCs w:val="1"/>
+          <w:rtl w:val="0"/>
+        </w:rPr>
+        <w:t xml:space="preserve">Core Principles:</w:t>
+      </w:r>
+    </w:p>
+    <w:p>
+      <w:pPr>
+        <w:numPr>
+          <w:ilvl w:val="0"/>
+          <w:numId w:val="7"/>
+        </w:numPr>
+        <w:ind w:left="600" w:hanging="360"/>
+      </w:pPr>
+      <w:r>
+        <w:rPr>
+          <w:b w:val="1"/>
+          <w:bCs w:val="1"/>
+          <w:rtl w:val="0"/>
+        </w:rPr>
+        <w:t xml:space="preserve">Architectural Decoupling:</w:t>
+      </w:r>
+      <w:r>
+        <w:rPr>
+          <w:rtl w:val="0"/>
+        </w:rPr>
+        <w:t xml:space="preserve"> Remediation workflows must operate asynchronously to prevent latency amplification in the core ingestion pipeline.</w:t>
+      </w:r>
+    </w:p>
+    <w:p>
+      <w:pPr>
+        <w:numPr>
+          <w:ilvl w:val="0"/>
+          <w:numId w:val="7"/>
+        </w:numPr>
+        <w:ind w:left="600" w:hanging="360"/>
+      </w:pPr>
+      <w:r>
+        <w:rPr>
+          <w:b w:val="1"/>
+          <w:bCs w:val="1"/>
+          <w:rtl w:val="0"/>
+        </w:rPr>
+        <w:t xml:space="preserve">Air-Gapped Security Model:</w:t>
+      </w:r>
+      <w:r>
+        <w:rPr>
+          <w:rtl w:val="0"/>
+        </w:rPr>
+        <w:t xml:space="preserve"> All AI inference and semantic processing must execute within isolated local compute environments without external network egress.</w:t>
+      </w:r>
+    </w:p>
+    <w:p>
+      <w:pPr>
+        <w:numPr>
+          <w:ilvl w:val="0"/>
+          <w:numId w:val="7"/>
+        </w:numPr>
+        <w:ind w:left="600" w:hanging="360"/>
+      </w:pPr>
+      <w:r>
+        <w:rPr>
+          <w:b w:val="1"/>
+          <w:bCs w:val="1"/>
+          <w:rtl w:val="0"/>
+        </w:rPr>
+        <w:t xml:space="preserve">Deterministic Logic Generation:</w:t>
+      </w:r>
+      <w:r>
+        <w:rPr>
+          <w:rtl w:val="0"/>
+        </w:rPr>
+        <w:t xml:space="preserve"> AI models generate functional transformation logic (executable code) rather than directly outputting synthesized data values.</w:t>
+      </w:r>
+    </w:p>
+    <w:p>
+      <w:pPr>
+        <w:numPr>
+          <w:ilvl w:val="0"/>
+          <w:numId w:val="7"/>
+        </w:numPr>
+        <w:pBdr>
+          <w:top w:space="0" w:sz="0" w:val="nil"/>
+          <w:left w:space="0" w:sz="0" w:val="nil"/>
+          <w:bottom w:space="0" w:sz="0" w:val="nil"/>
+          <w:right w:space="0" w:sz="0" w:val="nil"/>
+          <w:between w:space="0" w:sz="0" w:val="nil"/>
+        </w:pBdr>
+        <w:shd w:fill="auto" w:val="clear"/>
+        <w:ind w:left="600" w:hanging="360"/>
+        <w:rPr/>
+      </w:pPr>
+      <w:r>
+        <w:rPr>
+          <w:b w:val="1"/>
+          <w:bCs w:val="1"/>
+          <w:rtl w:val="0"/>
+        </w:rPr>
+        <w:t xml:space="preserve">Verifiable Auditability:</w:t>
+      </w:r>
+      <w:r>
+        <w:rPr>
+          <w:rtl w:val="0"/>
+        </w:rPr>
+        <w:t xml:space="preserve"> Every data transformation must be mathematically explainable, logged, and fully reversible.</w:t>
+      </w:r>
+      <w:r>
+        <w:rPr>
+          <w:rtl w:val="0"/>
+        </w:rPr>
+      </w:r>
+    </w:p>
+    <w:p>
+      <w:pPr>
+        <w:pStyle w:val="Heading2"/>
+        <w:pBdr>
+          <w:top w:space="0" w:sz="0" w:val="nil"/>
+          <w:left w:space="0" w:sz="0" w:val="nil"/>
+          <w:bottom w:space="0" w:sz="0" w:val="nil"/>
+          <w:right w:space="0" w:sz="0" w:val="nil"/>
+          <w:between w:space="0" w:sz="0" w:val="nil"/>
+        </w:pBdr>
+        <w:shd w:fill="auto" w:val="clear"/>
+        <w:rPr/>
+      </w:pPr>
+      <w:r>
+        <w:rPr>
+          <w:rtl w:val="0"/>
+        </w:rPr>
+        <w:t xml:space="preserve">4. PHASE 1: INGESTION &amp; DETERMINISTIC GOVERNANCE</w:t>
+      </w:r>
+    </w:p>
+    <w:p>
+      <w:pPr>
+        <w:pBdr>
+          <w:top w:space="0" w:sz="0" w:val="nil"/>
+          <w:left w:space="0" w:sz="0" w:val="nil"/>
+          <w:bottom w:space="0" w:sz="0" w:val="nil"/>
+          <w:right w:space="0" w:sz="0" w:val="nil"/>
+          <w:between w:space="0" w:sz="0" w:val="nil"/>
+        </w:pBdr>
+        <w:shd w:fill="auto" w:val="clear"/>
+        <w:spacing w:after="240" w:lineRule="auto"/>
+        <w:rPr/>
+      </w:pPr>
+      <w:r>
+        <w:rPr>
+          <w:rtl w:val="0"/>
+        </w:rPr>
+        <w:t xml:space="preserve">Prior to AI component engagement, the system enforces strict structural contracts during initial ingest</w:t>
+      </w:r>
+      <w:r>
+        <w:rPr>
+          <w:rtl w:val="0"/>
+        </w:rPr>
+        <w:t xml:space="preserve">.</w:t>
+      </w:r>
+    </w:p>
+    <w:p>
+      <w:pPr>
+        <w:pStyle w:val="Heading3"/>
+        <w:spacing w:before="0" w:lineRule="auto"/>
+        <w:rPr/>
+      </w:pPr>
+      <w:bookmarkStart w:colFirst="0" w:colLast="0" w:name="_heading=h.u25p2k1iz5p8" w:id="1"/>
+      <w:bookmarkEnd w:id="1"/>
+      <w:r>
+        <w:rPr>
+          <w:rtl w:val="0"/>
+        </w:rPr>
+        <w:t xml:space="preserve">4.1. Schema Variance Validation</w:t>
+      </w:r>
+    </w:p>
+    <w:p>
+      <w:pPr>
+        <w:pBdr>
+          <w:top w:space="0" w:sz="0" w:val="nil"/>
+          <w:left w:space="0" w:sz="0" w:val="nil"/>
+          <w:bottom w:space="0" w:sz="0" w:val="nil"/>
+          <w:right w:space="0" w:sz="0" w:val="nil"/>
+          <w:between w:space="0" w:sz="0" w:val="nil"/>
+        </w:pBdr>
+        <w:shd w:fill="auto" w:val="clear"/>
+        <w:rPr/>
+      </w:pPr>
+      <w:r>
+        <w:rPr>
+          <w:rtl w:val="0"/>
+        </w:rPr>
+        <w:t xml:space="preserve">During the pre-ingestion phase, the pipeline compares the cryptographic schema signature of the incoming source against the target data warehouse schema definition</w:t>
+      </w:r>
+      <w:r>
+        <w:rPr>
+          <w:rtl w:val="0"/>
+        </w:rPr>
+        <w:t xml:space="preserve">.</w:t>
+      </w:r>
+    </w:p>
+    <w:p>
+      <w:pPr>
+        <w:numPr>
+          <w:ilvl w:val="0"/>
+          <w:numId w:val="8"/>
+        </w:numPr>
+        <w:ind w:left="600" w:hanging="360"/>
+      </w:pPr>
+      <w:r>
+        <w:rPr>
+          <w:b w:val="1"/>
+          <w:bCs w:val="1"/>
+          <w:rtl w:val="0"/>
+        </w:rPr>
+        <w:t xml:space="preserve">Evaluation Logic:</w:t>
+      </w:r>
+      <w:r>
+        <w:rPr>
+          <w:rtl w:val="0"/>
+        </w:rPr>
+        <w:t xml:space="preserve"> If Hash(Source_Schema) != Hash(Target_Schema), the pipeline executes a high-priority exception trigger.</w:t>
+      </w:r>
+    </w:p>
+    <w:p>
+      <w:pPr>
+        <w:numPr>
+          <w:ilvl w:val="0"/>
+          <w:numId w:val="8"/>
+        </w:numPr>
+        <w:ind w:left="600" w:hanging="360"/>
+      </w:pPr>
+      <w:r>
+        <w:rPr>
+          <w:b w:val="1"/>
+          <w:bCs w:val="1"/>
+          <w:rtl w:val="0"/>
+        </w:rPr>
+        <w:t xml:space="preserve">Objective:</w:t>
+      </w:r>
+      <w:r>
+        <w:rPr>
+          <w:rtl w:val="0"/>
+        </w:rPr>
+        <w:t xml:space="preserve"> Prevents downstream pipeline failure resulting from unannounced upstream schema modifications (e.g., primitive type alterations from INTEGER to VARCHAR).</w:t>
+      </w:r>
+    </w:p>
+    <w:p>
+      <w:pPr>
+        <w:pStyle w:val="Heading3"/>
+        <w:rPr/>
+      </w:pPr>
+      <w:bookmarkStart w:colFirst="0" w:colLast="0" w:name="_heading=h.8uouei1al240" w:id="2"/>
+      <w:bookmarkEnd w:id="2"/>
+      <w:r>
+        <w:rPr>
+          <w:rtl w:val="0"/>
+        </w:rPr>
+        <w:t xml:space="preserve">4.2. Deterministic Validation Layer (Layer 1)</w:t>
+      </w:r>
+    </w:p>
+    <w:p>
+      <w:pPr>
+        <w:pBdr>
+          <w:top w:space="0" w:sz="0" w:val="nil"/>
+          <w:left w:space="0" w:sz="0" w:val="nil"/>
+          <w:bottom w:space="0" w:sz="0" w:val="nil"/>
+          <w:right w:space="0" w:sz="0" w:val="nil"/>
+          <w:between w:space="0" w:sz="0" w:val="nil"/>
+        </w:pBdr>
+        <w:shd w:fill="auto" w:val="clear"/>
+        <w:rPr/>
+      </w:pPr>
+      <w:r>
+        <w:rPr>
+          <w:rtl w:val="0"/>
+        </w:rPr>
+        <w:t xml:space="preserve">Ingested batches enter a high-performance validation layer executed via Polars/Python</w:t>
+      </w:r>
+      <w:r>
+        <w:rPr>
+          <w:rtl w:val="0"/>
+        </w:rPr>
+        <w:t xml:space="preserve">.</w:t>
+      </w:r>
+    </w:p>
+    <w:p>
+      <w:pPr>
+        <w:numPr>
+          <w:ilvl w:val="0"/>
+          <w:numId w:val="9"/>
+        </w:numPr>
+        <w:ind w:left="600" w:hanging="360"/>
+      </w:pPr>
+      <w:r>
+        <w:rPr>
+          <w:b w:val="1"/>
+          <w:bCs w:val="1"/>
+          <w:rtl w:val="0"/>
+        </w:rPr>
+        <w:t xml:space="preserve">Synchronous Execution Path:</w:t>
+      </w:r>
+      <w:r>
+        <w:rPr>
+          <w:rtl w:val="0"/>
+        </w:rPr>
+        <w:t xml:space="preserve"> Records satisfying structural constraints (null-value checks, boundary conditions, standard regex evaluation) bypass secondary processing and stream directly to the target storage engine.</w:t>
+      </w:r>
+    </w:p>
+    <w:p>
+      <w:pPr>
+        <w:numPr>
+          <w:ilvl w:val="0"/>
+          <w:numId w:val="9"/>
+        </w:numPr>
+        <w:pBdr>
+          <w:top w:space="0" w:sz="0" w:val="nil"/>
+          <w:left w:space="0" w:sz="0" w:val="nil"/>
+          <w:bottom w:space="0" w:sz="0" w:val="nil"/>
+          <w:right w:space="0" w:sz="0" w:val="nil"/>
+          <w:between w:space="0" w:sz="0" w:val="nil"/>
+        </w:pBdr>
+        <w:shd w:fill="auto" w:val="clear"/>
+        <w:ind w:left="600" w:hanging="360"/>
+        <w:rPr/>
+      </w:pPr>
+      <w:r>
+        <w:rPr>
+          <w:b w:val="1"/>
+          <w:bCs w:val="1"/>
+          <w:rtl w:val="0"/>
+        </w:rPr>
+        <w:t xml:space="preserve">Isolation Queue:</w:t>
+      </w:r>
+      <w:r>
+        <w:rPr>
+          <w:rtl w:val="0"/>
+        </w:rPr>
+        <w:t xml:space="preserve"> Records failing deterministic validation are tagged (Validation_Status = 'NEEDS_AI') and diverted to an asynchronous queue.</w:t>
+      </w:r>
+      <w:r>
+        <w:rPr>
+          <w:rtl w:val="0"/>
+        </w:rPr>
+      </w:r>
+    </w:p>
+    <w:p>
+      <w:pPr>
+        <w:pStyle w:val="Heading2"/>
+        <w:pBdr>
+          <w:top w:space="0" w:sz="0" w:val="nil"/>
+          <w:left w:space="0" w:sz="0" w:val="nil"/>
+          <w:bottom w:space="0" w:sz="0" w:val="nil"/>
+          <w:right w:space="0" w:sz="0" w:val="nil"/>
+          <w:between w:space="0" w:sz="0" w:val="nil"/>
+        </w:pBdr>
+        <w:shd w:fill="auto" w:val="clear"/>
+        <w:rPr/>
+      </w:pPr>
+      <w:r>
+        <w:rPr>
+          <w:rtl w:val="0"/>
+        </w:rPr>
+        <w:t xml:space="preserve">5. PHASE 2: ASYNCHRONOUS DECOUPLING &amp; SEMANTIC CLUSTERING</w:t>
+      </w:r>
+    </w:p>
+    <w:p>
+      <w:pPr>
+        <w:pBdr>
+          <w:top w:space="0" w:sz="0" w:val="nil"/>
+          <w:left w:space="0" w:sz="0" w:val="nil"/>
+          <w:bottom w:space="0" w:sz="0" w:val="nil"/>
+          <w:right w:space="0" w:sz="0" w:val="nil"/>
+          <w:between w:space="0" w:sz="0" w:val="nil"/>
+        </w:pBdr>
+        <w:shd w:fill="auto" w:val="clear"/>
+        <w:spacing w:after="240" w:lineRule="auto"/>
+        <w:rPr/>
+      </w:pPr>
+      <w:r>
+        <w:rPr>
+          <w:rtl w:val="0"/>
+        </w:rPr>
+        <w:t xml:space="preserve">To </w:t>
+      </w:r>
+      <w:r>
+        <w:rPr>
+          <w:rtl w:val="0"/>
+        </w:rPr>
+        <w:t xml:space="preserve">mitigate memory degradation and resource contention when handling high-cardinality data anomalies, Solva incorporates asynchronous queueing and vector-based data reduction</w:t>
+      </w:r>
+      <w:r>
+        <w:rPr>
+          <w:rtl w:val="0"/>
+        </w:rPr>
+        <w:t xml:space="preserve">.</w:t>
+      </w:r>
+    </w:p>
+    <w:p>
+      <w:pPr>
+        <w:pStyle w:val="Heading3"/>
+        <w:pBdr>
+          <w:top w:space="0" w:sz="0" w:val="nil"/>
+          <w:left w:space="0" w:sz="0" w:val="nil"/>
+          <w:bottom w:space="0" w:sz="0" w:val="nil"/>
+          <w:right w:space="0" w:sz="0" w:val="nil"/>
+          <w:between w:space="0" w:sz="0" w:val="nil"/>
+        </w:pBdr>
+        <w:shd w:fill="auto" w:val="clear"/>
+        <w:spacing w:before="0" w:lineRule="auto"/>
+        <w:rPr/>
+      </w:pPr>
+      <w:r>
+        <w:rPr>
+          <w:rtl w:val="0"/>
+        </w:rPr>
+        <w:t xml:space="preserve">5.1. The Message Queue</w:t>
+      </w:r>
+    </w:p>
+    <w:p>
+      <w:pPr>
+        <w:pBdr>
+          <w:top w:space="0" w:sz="0" w:val="nil"/>
+          <w:left w:space="0" w:sz="0" w:val="nil"/>
+          <w:bottom w:space="0" w:sz="0" w:val="nil"/>
+          <w:right w:space="0" w:sz="0" w:val="nil"/>
+          <w:between w:space="0" w:sz="0" w:val="nil"/>
+        </w:pBdr>
+        <w:shd w:fill="auto" w:val="clear"/>
+        <w:spacing w:after="240" w:lineRule="auto"/>
+        <w:rPr/>
+      </w:pPr>
+      <w:r>
+        <w:rPr>
+          <w:rtl w:val="0"/>
+        </w:rPr>
+        <w:t xml:space="preserve">Anomalous </w:t>
+      </w:r>
+      <w:r>
+        <w:rPr>
+          <w:rtl w:val="0"/>
+        </w:rPr>
+        <w:t xml:space="preserve">records are published to an isolated message broker instance (Redis/RabbitMQ). This decouples secondary processing, permitting the main ingestion pipeline to conclude execution and release system resources, maintaining operational availability</w:t>
+      </w:r>
+      <w:r>
+        <w:rPr>
+          <w:rtl w:val="0"/>
+        </w:rPr>
+        <w:t xml:space="preserve">.</w:t>
+      </w:r>
+    </w:p>
+    <w:p>
+      <w:pPr>
+        <w:pStyle w:val="Heading3"/>
+        <w:pBdr>
+          <w:top w:space="0" w:sz="0" w:val="nil"/>
+          <w:left w:space="0" w:sz="0" w:val="nil"/>
+          <w:bottom w:space="0" w:sz="0" w:val="nil"/>
+          <w:right w:space="0" w:sz="0" w:val="nil"/>
+          <w:between w:space="0" w:sz="0" w:val="nil"/>
+        </w:pBdr>
+        <w:shd w:fill="auto" w:val="clear"/>
+        <w:spacing w:before="0" w:lineRule="auto"/>
+        <w:rPr/>
+      </w:pPr>
+      <w:r>
+        <w:rPr>
+          <w:rtl w:val="0"/>
+        </w:rPr>
+        <w:t xml:space="preserve">5.2. Semantic Compression (ChromaDB)</w:t>
+      </w:r>
+    </w:p>
+    <w:p>
+      <w:pPr>
+        <w:pBdr>
+          <w:top w:space="0" w:sz="0" w:val="nil"/>
+          <w:left w:space="0" w:sz="0" w:val="nil"/>
+          <w:bottom w:space="0" w:sz="0" w:val="nil"/>
+          <w:right w:space="0" w:sz="0" w:val="nil"/>
+          <w:between w:space="0" w:sz="0" w:val="nil"/>
+        </w:pBdr>
+        <w:shd w:fill="auto" w:val="clear"/>
+        <w:rPr/>
+      </w:pPr>
+      <w:r>
+        <w:rPr>
+          <w:rtl w:val="0"/>
+        </w:rPr>
+        <w:t xml:space="preserve">To eliminate the overhead of independently processing redundant errors, the framework leverages vector embedding representations</w:t>
+      </w:r>
+      <w:r>
+        <w:rPr>
+          <w:rtl w:val="0"/>
+        </w:rPr>
+        <w:t xml:space="preserve">.</w:t>
+      </w:r>
+    </w:p>
+    <w:p>
+      <w:pPr>
+        <w:numPr>
+          <w:ilvl w:val="0"/>
+          <w:numId w:val="10"/>
+        </w:numPr>
+        <w:ind w:left="600" w:hanging="360"/>
+      </w:pPr>
+      <w:r>
+        <w:rPr>
+          <w:b w:val="1"/>
+          <w:bCs w:val="1"/>
+          <w:rtl w:val="0"/>
+        </w:rPr>
+        <w:t xml:space="preserve">Methodology:</w:t>
+      </w:r>
+      <w:r>
+        <w:rPr>
+          <w:rtl w:val="0"/>
+        </w:rPr>
+        <w:t xml:space="preserve"> Isolated malformed entries are converted into dense vector embeddings using a local transformer model. ChromaDB indexes these vectors to group entries based on mathematical and semantic closeness.</w:t>
+      </w:r>
+    </w:p>
+    <w:p>
+      <w:pPr>
+        <w:numPr>
+          <w:ilvl w:val="0"/>
+          <w:numId w:val="10"/>
+        </w:numPr>
+        <w:pBdr>
+          <w:top w:space="0" w:sz="0" w:val="nil"/>
+          <w:left w:space="0" w:sz="0" w:val="nil"/>
+          <w:bottom w:space="0" w:sz="0" w:val="nil"/>
+          <w:right w:space="0" w:sz="0" w:val="nil"/>
+          <w:between w:space="0" w:sz="0" w:val="nil"/>
+        </w:pBdr>
+        <w:shd w:fill="auto" w:val="clear"/>
+        <w:ind w:left="600" w:hanging="360"/>
+        <w:rPr/>
+      </w:pPr>
+      <w:r>
+        <w:rPr>
+          <w:b w:val="1"/>
+          <w:bCs w:val="1"/>
+          <w:rtl w:val="0"/>
+        </w:rPr>
+        <w:t xml:space="preserve">Dimensionality Reduction:</w:t>
+      </w:r>
+      <w:r>
+        <w:rPr>
+          <w:rtl w:val="0"/>
+        </w:rPr>
+        <w:t xml:space="preserve"> Large collections of textual anomalies (e.g., 50,000 distinct structural variants of a single temporal attribute) are clustered into ~100 distinct error patterns.</w:t>
+      </w:r>
+      <w:r>
+        <w:rPr>
+          <w:rtl w:val="0"/>
+        </w:rPr>
+      </w:r>
+    </w:p>
+    <w:p>
+      <w:pPr>
+        <w:pStyle w:val="Heading2"/>
+        <w:pBdr>
+          <w:top w:space="0" w:sz="0" w:val="nil"/>
+          <w:left w:space="0" w:sz="0" w:val="nil"/>
+          <w:bottom w:space="0" w:sz="0" w:val="nil"/>
+          <w:right w:space="0" w:sz="0" w:val="nil"/>
+          <w:between w:space="0" w:sz="0" w:val="nil"/>
+        </w:pBdr>
+        <w:shd w:fill="auto" w:val="clear"/>
+        <w:rPr/>
+      </w:pPr>
+      <w:r>
+        <w:rPr>
+          <w:rtl w:val="0"/>
+        </w:rPr>
+        <w:t xml:space="preserve">6. PHASE 3: AIR-GAPPED SLM REMEDIATION (The Engine)</w:t>
+      </w:r>
+    </w:p>
+    <w:p>
+      <w:pPr>
+        <w:pBdr>
+          <w:top w:space="0" w:sz="0" w:val="nil"/>
+          <w:left w:space="0" w:sz="0" w:val="nil"/>
+          <w:bottom w:space="0" w:sz="0" w:val="nil"/>
+          <w:right w:space="0" w:sz="0" w:val="nil"/>
+          <w:between w:space="0" w:sz="0" w:val="nil"/>
+        </w:pBdr>
+        <w:shd w:fill="auto" w:val="clear"/>
+        <w:spacing w:after="240" w:lineRule="auto"/>
+        <w:rPr/>
+      </w:pPr>
+      <w:r>
+        <w:rPr>
+          <w:rtl w:val="0"/>
+        </w:rPr>
+        <w:t xml:space="preserve">This phase </w:t>
+      </w:r>
+      <w:r>
+        <w:rPr>
+          <w:rtl w:val="0"/>
+        </w:rPr>
+        <w:t xml:space="preserve">forms the core automated transformation architecture</w:t>
+      </w:r>
+      <w:r>
+        <w:rPr>
+          <w:rtl w:val="0"/>
+        </w:rPr>
+        <w:t xml:space="preserve"> of Project Solva.</w:t>
+      </w:r>
+    </w:p>
+    <w:p>
+      <w:pPr>
+        <w:pStyle w:val="Heading3"/>
+        <w:pBdr>
+          <w:top w:space="0" w:sz="0" w:val="nil"/>
+          <w:left w:space="0" w:sz="0" w:val="nil"/>
+          <w:bottom w:space="0" w:sz="0" w:val="nil"/>
+          <w:right w:space="0" w:sz="0" w:val="nil"/>
+          <w:between w:space="0" w:sz="0" w:val="nil"/>
+        </w:pBdr>
+        <w:shd w:fill="auto" w:val="clear"/>
+        <w:spacing w:before="0" w:lineRule="auto"/>
+        <w:rPr/>
+      </w:pPr>
+      <w:r>
+        <w:rPr>
+          <w:rtl w:val="0"/>
+        </w:rPr>
+        <w:t xml:space="preserve">6.1. Metadata Extraction</w:t>
+      </w:r>
+    </w:p>
+    <w:p>
+      <w:pPr>
+        <w:pBdr>
+          <w:top w:space="0" w:sz="0" w:val="nil"/>
+          <w:left w:space="0" w:sz="0" w:val="nil"/>
+          <w:bottom w:space="0" w:sz="0" w:val="nil"/>
+          <w:right w:space="0" w:sz="0" w:val="nil"/>
+          <w:between w:space="0" w:sz="0" w:val="nil"/>
+        </w:pBdr>
+        <w:shd w:fill="auto" w:val="clear"/>
+        <w:spacing w:after="240" w:lineRule="auto"/>
+        <w:rPr/>
+      </w:pPr>
+      <w:r>
+        <w:rPr>
+          <w:rtl w:val="0"/>
+        </w:rPr>
+        <w:t xml:space="preserve">A background worker process extracts a representative sample subset (typically 3–5 records along with associated metadata) from a target</w:t>
+      </w:r>
+      <w:r>
+        <w:rPr>
+          <w:rtl w:val="0"/>
+        </w:rPr>
+        <w:t xml:space="preserve"> ChromaDB cluster.</w:t>
+      </w:r>
+    </w:p>
+    <w:p>
+      <w:pPr>
+        <w:pStyle w:val="Heading3"/>
+        <w:pBdr>
+          <w:top w:space="0" w:sz="0" w:val="nil"/>
+          <w:left w:space="0" w:sz="0" w:val="nil"/>
+          <w:bottom w:space="0" w:sz="0" w:val="nil"/>
+          <w:right w:space="0" w:sz="0" w:val="nil"/>
+          <w:between w:space="0" w:sz="0" w:val="nil"/>
+        </w:pBdr>
+        <w:shd w:fill="auto" w:val="clear"/>
+        <w:spacing w:before="0" w:lineRule="auto"/>
+        <w:rPr/>
+      </w:pPr>
+      <w:r>
+        <w:rPr>
+          <w:rtl w:val="0"/>
+        </w:rPr>
+        <w:t xml:space="preserve">6.2. Restricted Transformation Logic Generation (Sandboxed Execution)</w:t>
+      </w:r>
+      <w:r>
+        <w:rPr>
+          <w:rtl w:val="0"/>
+        </w:rPr>
+      </w:r>
+    </w:p>
+    <w:p>
+      <w:pPr>
+        <w:pBdr>
+          <w:top w:space="0" w:sz="0" w:val="nil"/>
+          <w:left w:space="0" w:sz="0" w:val="nil"/>
+          <w:bottom w:space="0" w:sz="0" w:val="nil"/>
+          <w:right w:space="0" w:sz="0" w:val="nil"/>
+          <w:between w:space="0" w:sz="0" w:val="nil"/>
+        </w:pBdr>
+        <w:shd w:fill="auto" w:val="clear"/>
+        <w:rPr/>
+      </w:pPr>
+      <w:r>
+        <w:rPr>
+          <w:rtl w:val="0"/>
+        </w:rPr>
+        <w:t xml:space="preserve">The </w:t>
+      </w:r>
+      <w:r>
+        <w:rPr>
+          <w:rtl w:val="0"/>
+        </w:rPr>
+        <w:t xml:space="preserve">extracted sample is evaluated by an air-gapped SLM instance (e.g., Llama-3 8B or Phi-3 deployed via Ollama). Prompt structures restrict model output exclusively to deterministic code constructs, such as sandboxed Pandas lambda functions or structural parsing rules</w:t>
+      </w:r>
+      <w:r>
+        <w:rPr>
+          <w:rtl w:val="0"/>
+        </w:rPr>
+        <w:t xml:space="preserve">.</w:t>
+      </w:r>
+    </w:p>
+    <w:p>
+      <w:pPr>
+        <w:numPr>
+          <w:ilvl w:val="0"/>
+          <w:numId w:val="11"/>
+        </w:numPr>
+        <w:ind w:left="600" w:hanging="360"/>
+      </w:pPr>
+      <w:r>
+        <w:rPr>
+          <w:b w:val="1"/>
+          <w:bCs w:val="1"/>
+          <w:rtl w:val="0"/>
+        </w:rPr>
+        <w:t xml:space="preserve">Rationale:</w:t>
+      </w:r>
+      <w:r>
+        <w:rPr>
+          <w:rtl w:val="0"/>
+        </w:rPr>
+        <w:t xml:space="preserve"> Direct AI generation of target data values introduces hallucination risks. Consequently, the SLM is restricted to synthesizing deterministic transformation functions, which are subsequently validated and executed by the runtime environment.</w:t>
+      </w:r>
+    </w:p>
+    <w:p>
+      <w:pPr>
+        <w:pStyle w:val="Heading3"/>
+        <w:pBdr>
+          <w:top w:space="0" w:sz="0" w:val="nil"/>
+          <w:left w:space="0" w:sz="0" w:val="nil"/>
+          <w:bottom w:space="0" w:sz="0" w:val="nil"/>
+          <w:right w:space="0" w:sz="0" w:val="nil"/>
+          <w:between w:space="0" w:sz="0" w:val="nil"/>
+        </w:pBdr>
+        <w:shd w:fill="auto" w:val="clear"/>
+        <w:rPr/>
+      </w:pPr>
+      <w:r>
+        <w:rPr>
+          <w:rtl w:val="0"/>
+        </w:rPr>
+        <w:t xml:space="preserve">6.3. Batch Function Execution</w:t>
+      </w:r>
+      <w:r>
+        <w:rPr>
+          <w:rtl w:val="0"/>
+        </w:rPr>
+      </w:r>
+    </w:p>
+    <w:p>
+      <w:pPr>
+        <w:pBdr>
+          <w:top w:space="0" w:sz="0" w:val="nil"/>
+          <w:left w:space="0" w:sz="0" w:val="nil"/>
+          <w:bottom w:space="0" w:sz="0" w:val="nil"/>
+          <w:right w:space="0" w:sz="0" w:val="nil"/>
+          <w:between w:space="0" w:sz="0" w:val="nil"/>
+        </w:pBdr>
+        <w:shd w:fill="auto" w:val="clear"/>
+        <w:spacing w:after="225" w:lineRule="auto"/>
+        <w:rPr/>
+      </w:pPr>
+      <w:r>
+        <w:rPr>
+          <w:rtl w:val="0"/>
+        </w:rPr>
+        <w:t xml:space="preserve">The </w:t>
+      </w:r>
+      <w:r>
+        <w:rPr>
+          <w:rtl w:val="0"/>
+        </w:rPr>
+        <w:t xml:space="preserve">platform parses the synthesized Python transformation code and applies it across the entire dataset represented within the corresponding vector cluster, achieving high-throughput batch normalization</w:t>
+      </w:r>
+      <w:r>
+        <w:rPr>
+          <w:rtl w:val="0"/>
+        </w:rPr>
+        <w:t xml:space="preserve">.</w:t>
+      </w:r>
+    </w:p>
+    <w:p>
+      <w:pPr>
+        <w:pStyle w:val="Heading2"/>
+        <w:spacing w:before="0" w:lineRule="auto"/>
+        <w:rPr/>
+      </w:pPr>
+      <w:bookmarkStart w:colFirst="0" w:colLast="0" w:name="_heading=h.l394xqogqph4" w:id="3"/>
+      <w:bookmarkEnd w:id="3"/>
+      <w:r>
+        <w:rPr>
+          <w:rtl w:val="0"/>
+        </w:rPr>
+        <w:t xml:space="preserve">7. PHASE 4: ENTERPRISE SAFETY GUARDRAILS &amp; REVERSIBILITY FRAMEWORK</w:t>
+      </w:r>
+    </w:p>
+    <w:p>
+      <w:pPr>
+        <w:pBdr>
+          <w:top w:space="0" w:sz="0" w:val="nil"/>
+          <w:left w:space="0" w:sz="0" w:val="nil"/>
+          <w:bottom w:space="0" w:sz="0" w:val="nil"/>
+          <w:right w:space="0" w:sz="0" w:val="nil"/>
+          <w:between w:space="0" w:sz="0" w:val="nil"/>
+        </w:pBdr>
+        <w:shd w:fill="auto" w:val="clear"/>
+        <w:spacing w:after="240" w:lineRule="auto"/>
+        <w:rPr/>
+      </w:pPr>
+      <w:r>
+        <w:rPr>
+          <w:rtl w:val="0"/>
+        </w:rPr>
+        <w:t xml:space="preserve">Enterprise production environments require strict error-handling protocols to mitigate non-deterministic model behaviors. Project Solva incorporates comprehensive DataOps control mechanisms</w:t>
+      </w:r>
+      <w:r>
+        <w:rPr>
+          <w:rtl w:val="0"/>
+        </w:rPr>
+        <w:t xml:space="preserve">.</w:t>
+      </w:r>
+    </w:p>
+    <w:p>
+      <w:pPr>
+        <w:pStyle w:val="Heading3"/>
+        <w:pBdr>
+          <w:top w:space="0" w:sz="0" w:val="nil"/>
+          <w:left w:space="0" w:sz="0" w:val="nil"/>
+          <w:bottom w:space="0" w:sz="0" w:val="nil"/>
+          <w:right w:space="0" w:sz="0" w:val="nil"/>
+          <w:between w:space="0" w:sz="0" w:val="nil"/>
+        </w:pBdr>
+        <w:shd w:fill="auto" w:val="clear"/>
+        <w:spacing w:before="0" w:lineRule="auto"/>
+        <w:rPr/>
+      </w:pPr>
+      <w:r>
+        <w:rPr>
+          <w:rtl w:val="0"/>
+        </w:rPr>
+        <w:t xml:space="preserve">7.1. Hybrid Cryptographic Fingerprinting</w:t>
+      </w:r>
+      <w:r>
+        <w:rPr>
+          <w:rtl w:val="0"/>
+        </w:rPr>
+      </w:r>
+    </w:p>
+    <w:p>
+      <w:pPr>
+        <w:pBdr>
+          <w:top w:space="0" w:sz="0" w:val="nil"/>
+          <w:left w:space="0" w:sz="0" w:val="nil"/>
+          <w:bottom w:space="0" w:sz="0" w:val="nil"/>
+          <w:right w:space="0" w:sz="0" w:val="nil"/>
+          <w:between w:space="0" w:sz="0" w:val="nil"/>
+        </w:pBdr>
+        <w:shd w:fill="auto" w:val="clear"/>
+        <w:rPr/>
+      </w:pPr>
+      <w:r>
+        <w:rPr>
+          <w:rtl w:val="0"/>
+        </w:rPr>
+        <w:t xml:space="preserve">Vector </w:t>
+      </w:r>
+      <w:r>
+        <w:rPr>
+          <w:rtl w:val="0"/>
+        </w:rPr>
+        <w:t xml:space="preserve">space proximity evaluations can produce false-positive pairings between distinct records with high similarity metrics (e.g., "John Doe ID:101" versus "Jon Doe ID:102")</w:t>
+      </w:r>
+      <w:r>
+        <w:rPr>
+          <w:rtl w:val="0"/>
+        </w:rPr>
+        <w:t xml:space="preserve">.</w:t>
+      </w:r>
+    </w:p>
+    <w:p>
+      <w:pPr>
+        <w:numPr>
+          <w:ilvl w:val="0"/>
+          <w:numId w:val="2"/>
+        </w:numPr>
+        <w:ind w:left="600" w:hanging="360"/>
+      </w:pPr>
+      <w:r>
+        <w:rPr>
+          <w:b w:val="1"/>
+          <w:bCs w:val="1"/>
+          <w:rtl w:val="0"/>
+        </w:rPr>
+        <w:t xml:space="preserve">Mitigation Strategy:</w:t>
+      </w:r>
+      <w:r>
+        <w:rPr>
+          <w:rtl w:val="0"/>
+        </w:rPr>
+        <w:t xml:space="preserve"> Semantic similarity evaluations are coupled with strict </w:t>
+      </w:r>
+      <w:r>
+        <w:rPr>
+          <w:b w:val="1"/>
+          <w:bCs w:val="1"/>
+          <w:rtl w:val="0"/>
+        </w:rPr>
+        <w:t xml:space="preserve">SHA-256 primary key hashing</w:t>
+      </w:r>
+      <w:r>
+        <w:rPr>
+          <w:rtl w:val="0"/>
+        </w:rPr>
+        <w:t xml:space="preserve">. Distinct primary key hashes force record segregation regardless of vector proximity, preventing improper entity consolidation.</w:t>
+      </w:r>
+    </w:p>
+    <w:p>
+      <w:pPr>
+        <w:pStyle w:val="Heading3"/>
+        <w:rPr/>
+      </w:pPr>
+      <w:bookmarkStart w:colFirst="0" w:colLast="0" w:name="_heading=h.63vevzfta44j" w:id="4"/>
+      <w:bookmarkEnd w:id="4"/>
+      <w:r>
+        <w:rPr>
+          <w:rtl w:val="0"/>
+        </w:rPr>
+        <w:t xml:space="preserve">7.2. Staged Promotion and Automated Testing</w:t>
+      </w:r>
+    </w:p>
+    <w:p>
+      <w:pPr>
+        <w:pBdr>
+          <w:top w:space="0" w:sz="0" w:val="nil"/>
+          <w:left w:space="0" w:sz="0" w:val="nil"/>
+          <w:bottom w:space="0" w:sz="0" w:val="nil"/>
+          <w:right w:space="0" w:sz="0" w:val="nil"/>
+          <w:between w:space="0" w:sz="0" w:val="nil"/>
+        </w:pBdr>
+        <w:shd w:fill="auto" w:val="clear"/>
+        <w:rPr/>
+      </w:pPr>
+      <w:r>
+        <w:rPr>
+          <w:rtl w:val="0"/>
+        </w:rPr>
+        <w:t xml:space="preserve">Remediated data is never committed directly to primary</w:t>
+      </w:r>
+      <w:r>
+        <w:rPr>
+          <w:rtl w:val="0"/>
+        </w:rPr>
+        <w:t xml:space="preserve"> production tables.</w:t>
+      </w:r>
+    </w:p>
+    <w:p>
+      <w:pPr>
+        <w:numPr>
+          <w:ilvl w:val="0"/>
+          <w:numId w:val="3"/>
+        </w:numPr>
+        <w:ind w:left="600" w:hanging="360"/>
+      </w:pPr>
+      <w:r>
+        <w:rPr>
+          <w:b w:val="1"/>
+          <w:bCs w:val="1"/>
+          <w:rtl w:val="0"/>
+        </w:rPr>
+        <w:t xml:space="preserve">Staging Isolation:</w:t>
+      </w:r>
+      <w:r>
+        <w:rPr>
+          <w:rtl w:val="0"/>
+        </w:rPr>
+        <w:t xml:space="preserve"> Remediated output is written to a restricted Staging Schema environment.</w:t>
+      </w:r>
+    </w:p>
+    <w:p>
+      <w:pPr>
+        <w:numPr>
+          <w:ilvl w:val="0"/>
+          <w:numId w:val="3"/>
+        </w:numPr>
+        <w:ind w:left="600" w:hanging="360"/>
+      </w:pPr>
+      <w:r>
+        <w:rPr>
+          <w:b w:val="1"/>
+          <w:bCs w:val="1"/>
+          <w:rtl w:val="0"/>
+        </w:rPr>
+        <w:t xml:space="preserve">Automated Quality Verification:</w:t>
+      </w:r>
+      <w:r>
+        <w:rPr>
+          <w:rtl w:val="0"/>
+        </w:rPr>
+        <w:t xml:space="preserve"> Automated dbt (Data Build Tool) test suites execute against the staged entities to confirm compliance with business logic rules.</w:t>
+      </w:r>
+    </w:p>
+    <w:p>
+      <w:pPr>
+        <w:numPr>
+          <w:ilvl w:val="0"/>
+          <w:numId w:val="3"/>
+        </w:numPr>
+        <w:ind w:left="600" w:hanging="360"/>
+      </w:pPr>
+      <w:r>
+        <w:rPr>
+          <w:b w:val="1"/>
+          <w:bCs w:val="1"/>
+          <w:rtl w:val="0"/>
+        </w:rPr>
+        <w:t xml:space="preserve">Conditional Production Promotion:</w:t>
+      </w:r>
+      <w:r>
+        <w:rPr>
+          <w:rtl w:val="0"/>
+        </w:rPr>
+        <w:t xml:space="preserve"> Staged datasets are promoted to Production exclusively upon passing all test criteria. Failed validations route the affected batch to a manual quarantine interface.</w:t>
+      </w:r>
+    </w:p>
+    <w:p>
+      <w:pPr>
+        <w:pStyle w:val="Heading3"/>
+        <w:pBdr>
+          <w:top w:space="0" w:sz="0" w:val="nil"/>
+          <w:left w:space="0" w:sz="0" w:val="nil"/>
+          <w:bottom w:space="0" w:sz="0" w:val="nil"/>
+          <w:right w:space="0" w:sz="0" w:val="nil"/>
+          <w:between w:space="0" w:sz="0" w:val="nil"/>
+        </w:pBdr>
+        <w:shd w:fill="auto" w:val="clear"/>
+        <w:rPr/>
+      </w:pPr>
+      <w:r>
+        <w:rPr>
+          <w:rtl w:val="0"/>
+        </w:rPr>
+        <w:t xml:space="preserve">7.3. Explainable AI (XAI) and Provenance Logging</w:t>
+      </w:r>
+      <w:r>
+        <w:rPr>
+          <w:rtl w:val="0"/>
+        </w:rPr>
+      </w:r>
+    </w:p>
+    <w:p>
+      <w:pPr>
+        <w:pBdr>
+          <w:top w:space="0" w:sz="0" w:val="nil"/>
+          <w:left w:space="0" w:sz="0" w:val="nil"/>
+          <w:bottom w:space="0" w:sz="0" w:val="nil"/>
+          <w:right w:space="0" w:sz="0" w:val="nil"/>
+          <w:between w:space="0" w:sz="0" w:val="nil"/>
+        </w:pBdr>
+        <w:shd w:fill="auto" w:val="clear"/>
+        <w:spacing w:after="240" w:lineRule="auto"/>
+        <w:rPr/>
+      </w:pPr>
+      <w:r>
+        <w:rPr>
+          <w:rtl w:val="0"/>
+        </w:rPr>
+        <w:t xml:space="preserve">The SLM </w:t>
+      </w:r>
+      <w:r>
+        <w:rPr>
+          <w:rtl w:val="0"/>
+        </w:rPr>
+        <w:t xml:space="preserve">is configured to output structured JSON responses containing explicit confidence scores and reasoning strings. Every record state modification is captured within an immutable Audit Log: [Row_ID, Original_Value, Modified_Value, Model_Reasoning, Confidence_Score, Model_Identifier</w:t>
+      </w:r>
+      <w:r>
+        <w:rPr>
+          <w:rtl w:val="0"/>
+        </w:rPr>
+        <w:t xml:space="preserve">, Timestamp]</w:t>
+      </w:r>
+    </w:p>
+    <w:p>
+      <w:pPr>
+        <w:pStyle w:val="Heading3"/>
+        <w:spacing w:before="0" w:lineRule="auto"/>
+        <w:rPr/>
+      </w:pPr>
+      <w:bookmarkStart w:colFirst="0" w:colLast="0" w:name="_heading=h.53kihmskl6v0" w:id="5"/>
+      <w:bookmarkEnd w:id="5"/>
+      <w:r>
+        <w:rPr>
+          <w:rtl w:val="0"/>
+        </w:rPr>
+        <w:t xml:space="preserve">7.4. Zero-Data-Loss Reconciliation Protocol</w:t>
+      </w:r>
+    </w:p>
+    <w:p>
+      <w:pPr>
+        <w:pBdr>
+          <w:top w:space="0" w:sz="0" w:val="nil"/>
+          <w:left w:space="0" w:sz="0" w:val="nil"/>
+          <w:bottom w:space="0" w:sz="0" w:val="nil"/>
+          <w:right w:space="0" w:sz="0" w:val="nil"/>
+          <w:between w:space="0" w:sz="0" w:val="nil"/>
+        </w:pBdr>
+        <w:shd w:fill="auto" w:val="clear"/>
+        <w:spacing w:after="225" w:lineRule="auto"/>
+        <w:rPr/>
+      </w:pPr>
+      <w:r>
+        <w:rPr>
+          <w:rtl w:val="0"/>
+        </w:rPr>
+        <w:t xml:space="preserve">Upon batch execution completion, a mathematical reconciliation calculation evaluates record state distribution: Total_Source_Records == (Successfully_Ingested_Records + Quarantined_Records). Any non-zero disparity triggers an immediate system alert and halts process finalization</w:t>
+      </w:r>
+      <w:r>
+        <w:rPr>
+          <w:rtl w:val="0"/>
+        </w:rPr>
+        <w:t xml:space="preserve">.</w:t>
+      </w:r>
+    </w:p>
+    <w:p>
+      <w:pPr>
+        <w:pStyle w:val="Heading2"/>
+        <w:spacing w:before="0" w:lineRule="auto"/>
+        <w:rPr/>
+      </w:pPr>
+      <w:bookmarkStart w:colFirst="0" w:colLast="0" w:name="_heading=h.y5579grd9hxt" w:id="6"/>
+      <w:bookmarkEnd w:id="6"/>
+      <w:r>
+        <w:rPr>
+          <w:rtl w:val="0"/>
+        </w:rPr>
+        <w:t xml:space="preserve">8. FALLBACK MECHANISMS AND CIRCUIT BREAKER PROTOCOLS</w:t>
+      </w:r>
+    </w:p>
+    <w:p>
+      <w:pPr>
+        <w:pBdr>
+          <w:top w:space="0" w:sz="0" w:val="nil"/>
+          <w:left w:space="0" w:sz="0" w:val="nil"/>
+          <w:bottom w:space="0" w:sz="0" w:val="nil"/>
+          <w:right w:space="0" w:sz="0" w:val="nil"/>
+          <w:between w:space="0" w:sz="0" w:val="nil"/>
+        </w:pBdr>
+        <w:shd w:fill="auto" w:val="clear"/>
+        <w:rPr/>
+      </w:pPr>
+      <w:r>
+        <w:rPr>
+          <w:b w:val="1"/>
+          <w:bCs w:val="1"/>
+          <w:rtl w:val="0"/>
+        </w:rPr>
+        <w:t xml:space="preserve">System State Scenario:</w:t>
+      </w:r>
+      <w:r>
+        <w:rPr>
+          <w:rtl w:val="0"/>
+        </w:rPr>
+        <w:t xml:space="preserve"> Schema drift occurs concurrently with an exception in the primary validation layer, while local SLM services are unavailable</w:t>
+      </w:r>
+      <w:r>
+        <w:rPr>
+          <w:rtl w:val="0"/>
+        </w:rPr>
+        <w:t xml:space="preserve">.</w:t>
+      </w:r>
+    </w:p>
+    <w:p>
+      <w:pPr>
+        <w:pBdr>
+          <w:top w:space="0" w:sz="0" w:val="nil"/>
+          <w:left w:space="0" w:sz="0" w:val="nil"/>
+          <w:bottom w:space="0" w:sz="0" w:val="nil"/>
+          <w:right w:space="0" w:sz="0" w:val="nil"/>
+          <w:between w:space="0" w:sz="0" w:val="nil"/>
+        </w:pBdr>
+        <w:shd w:fill="auto" w:val="clear"/>
+        <w:rPr/>
+      </w:pPr>
+      <w:r>
+        <w:rPr>
+          <w:b w:val="1"/>
+          <w:bCs w:val="1"/>
+          <w:rtl w:val="0"/>
+        </w:rPr>
+        <w:t xml:space="preserve">Fallback Execution</w:t>
+      </w:r>
+      <w:r>
+        <w:rPr>
+          <w:b w:val="1"/>
+          <w:bCs w:val="1"/>
+          <w:rtl w:val="0"/>
+        </w:rPr>
+        <w:t xml:space="preserve"> Protocol:</w:t>
+      </w:r>
+      <w:r>
+        <w:rPr>
+          <w:rtl w:val="0"/>
+        </w:rPr>
+        <w:t xml:space="preserve"> The architecture transitions automatically from active remediation mode to absolute data preservation mode</w:t>
+      </w:r>
+      <w:r>
+        <w:rPr>
+          <w:rtl w:val="0"/>
+        </w:rPr>
+        <w:t xml:space="preserve">.</w:t>
+      </w:r>
+    </w:p>
+    <w:p>
+      <w:pPr>
+        <w:numPr>
+          <w:ilvl w:val="0"/>
+          <w:numId w:val="4"/>
+        </w:numPr>
+        <w:ind w:left="600" w:hanging="360"/>
+      </w:pPr>
+      <w:r>
+        <w:rPr>
+          <w:b w:val="1"/>
+          <w:bCs w:val="1"/>
+          <w:rtl w:val="0"/>
+        </w:rPr>
+        <w:t xml:space="preserve">Circuit Breaker Activation:</w:t>
+      </w:r>
+      <w:r>
+        <w:rPr>
+          <w:rtl w:val="0"/>
+        </w:rPr>
+        <w:t xml:space="preserve"> Data ingestion for the affected stream is immediately interrupted to isolate the system state and prevent error propagation.</w:t>
+      </w:r>
+    </w:p>
+    <w:p>
+      <w:pPr>
+        <w:numPr>
+          <w:ilvl w:val="0"/>
+          <w:numId w:val="4"/>
+        </w:numPr>
+        <w:ind w:left="600" w:hanging="360"/>
+      </w:pPr>
+      <w:r>
+        <w:rPr>
+          <w:b w:val="1"/>
+          <w:bCs w:val="1"/>
+          <w:rtl w:val="0"/>
+        </w:rPr>
+        <w:t xml:space="preserve">Immutable Data Serialization:</w:t>
+      </w:r>
+      <w:r>
+        <w:rPr>
+          <w:rtl w:val="0"/>
+        </w:rPr>
+        <w:t xml:space="preserve"> Unparsed input payloads are serialized into raw binary formats (JSON/Parquet) and written directly to cold storage instances (e.g., AWS S3) or a Dead Letter Queue (DLQ).</w:t>
+      </w:r>
+    </w:p>
+    <w:p>
+      <w:pPr>
+        <w:numPr>
+          <w:ilvl w:val="0"/>
+          <w:numId w:val="4"/>
+        </w:numPr>
+        <w:ind w:left="600" w:hanging="360"/>
+      </w:pPr>
+      <w:r>
+        <w:rPr>
+          <w:b w:val="1"/>
+          <w:bCs w:val="1"/>
+          <w:rtl w:val="0"/>
+        </w:rPr>
+        <w:t xml:space="preserve">Escalation Notification:</w:t>
+      </w:r>
+      <w:r>
+        <w:rPr>
+          <w:rtl w:val="0"/>
+        </w:rPr>
+        <w:t xml:space="preserve"> A high-priority event notification containing system telemetry, stack trace, and storage URIs is dispatched to incident management platforms.</w:t>
       </w:r>
     </w:p>
     <w:p>
@@ -594,109 +2155,18 @@
           <w:bCs w:val="1"/>
           <w:rtl w:val="0"/>
         </w:rPr>
-        <w:t xml:space="preserve">The "Manual Scripting" Tax:</w:t>
-      </w:r>
-      <w:r>
-        <w:rPr>
-          <w:rtl w:val="0"/>
-        </w:rPr>
-        <w:t xml:space="preserve"> Data Quality relies on hardcoded Regex or SQL rules. Every new anomaly requires a new line of code written by a human.</w:t>
-      </w:r>
-    </w:p>
-    <w:p>
-      <w:pPr>
-        <w:numPr>
-          <w:ilvl w:val="0"/>
-          <w:numId w:val="4"/>
-        </w:numPr>
-        <w:pBdr>
-          <w:top w:space="0" w:sz="0" w:val="nil"/>
-          <w:left w:space="0" w:sz="0" w:val="nil"/>
-          <w:bottom w:space="0" w:sz="0" w:val="nil"/>
-          <w:right w:space="0" w:sz="0" w:val="nil"/>
-          <w:between w:space="0" w:sz="0" w:val="nil"/>
-        </w:pBdr>
-        <w:shd w:fill="auto" w:val="clear"/>
-        <w:ind w:left="600" w:hanging="360"/>
-        <w:rPr/>
-      </w:pPr>
-      <w:r>
-        <w:rPr>
-          <w:b w:val="1"/>
-          <w:bCs w:val="1"/>
-          <w:rtl w:val="0"/>
-        </w:rPr>
-        <w:t xml:space="preserve">The LLM Throughput Bottleneck:</w:t>
-      </w:r>
-      <w:r>
-        <w:rPr>
-          <w:rtl w:val="0"/>
-        </w:rPr>
-        <w:t xml:space="preserve"> Processing 100,000 bad rows individually through an LLM (RAG) is computationally impossible, resulting in massive latency, rate limits, and OOM (Out of Memory) crashes.</w:t>
-      </w:r>
-    </w:p>
-    <w:p>
-      <w:pPr>
-        <w:numPr>
-          <w:ilvl w:val="0"/>
-          <w:numId w:val="4"/>
-        </w:numPr>
-        <w:pBdr>
-          <w:top w:space="0" w:sz="0" w:val="nil"/>
-          <w:left w:space="0" w:sz="0" w:val="nil"/>
-          <w:bottom w:space="0" w:sz="0" w:val="nil"/>
-          <w:right w:space="0" w:sz="0" w:val="nil"/>
-          <w:between w:space="0" w:sz="0" w:val="nil"/>
-        </w:pBdr>
-        <w:shd w:fill="auto" w:val="clear"/>
-        <w:ind w:left="600" w:hanging="360"/>
-        <w:rPr/>
-      </w:pPr>
-      <w:r>
-        <w:rPr>
-          <w:b w:val="1"/>
-          <w:bCs w:val="1"/>
-          <w:rtl w:val="0"/>
-        </w:rPr>
-        <w:t xml:space="preserve">Data Sovereignty &amp; Privacy Risks:</w:t>
-      </w:r>
-      <w:r>
-        <w:rPr>
-          <w:rtl w:val="0"/>
-        </w:rPr>
-        <w:t xml:space="preserve"> Sending Personally Identifiable Information (PII) like Bank Accounts or Medical Records to public APIs (OpenAI/Gemini) is a strict compliance violation for B2B enterprises.</w:t>
-      </w:r>
-    </w:p>
-    <w:p>
-      <w:pPr>
-        <w:numPr>
-          <w:ilvl w:val="0"/>
-          <w:numId w:val="4"/>
-        </w:numPr>
-        <w:pBdr>
-          <w:top w:space="0" w:sz="0" w:val="nil"/>
-          <w:left w:space="0" w:sz="0" w:val="nil"/>
-          <w:bottom w:space="0" w:sz="0" w:val="nil"/>
-          <w:right w:space="0" w:sz="0" w:val="nil"/>
-          <w:between w:space="0" w:sz="0" w:val="nil"/>
-        </w:pBdr>
-        <w:shd w:fill="auto" w:val="clear"/>
-        <w:ind w:left="600" w:hanging="360"/>
-        <w:rPr/>
-      </w:pPr>
-      <w:r>
-        <w:rPr>
-          <w:b w:val="1"/>
-          <w:bCs w:val="1"/>
-          <w:rtl w:val="0"/>
-        </w:rPr>
-        <w:t xml:space="preserve">Silent Data Corruption &amp; False Positives:</w:t>
-      </w:r>
-      <w:r>
-        <w:rPr>
-          <w:rtl w:val="0"/>
-        </w:rPr>
-        <w:t xml:space="preserve"> Automated tools often misclassify data, merging distinct records (False Positives) or dropping rows without triggering alerts (Silent Data Loss).</w:t>
+        <w:t xml:space="preserve">Replayability Support:</w:t>
+      </w:r>
+      <w:r>
+        <w:rPr>
+          <w:rtl w:val="0"/>
+        </w:rPr>
+        <w:t xml:space="preserve"> Engineering personnel can refine parsing rules and re-inject raw payload batches from cold storage, ensuring total data retention despite critical infrastructure failures.</w:t>
+      </w:r>
+      <w:r>
+        <w:rPr>
+          <w:rtl w:val="0"/>
+        </w:rPr>
       </w:r>
     </w:p>
     <w:p>
@@ -710,244 +2180,6 @@
           <w:between w:space="0" w:sz="0" w:val="nil"/>
         </w:pBdr>
         <w:shd w:fill="auto" w:val="clear"/>
-        <w:rPr/>
-      </w:pPr>
-      <w:r>
-        <w:rPr>
-          <w:rtl w:val="0"/>
-        </w:rPr>
-        <w:t xml:space="preserve">3. PROPOSED ARCHITECTURE OVERVIEW</w:t>
-      </w:r>
-    </w:p>
-    <w:p>
-      <w:pPr>
-        <w:pBdr>
-          <w:top w:space="0" w:sz="0" w:val="nil"/>
-          <w:left w:space="0" w:sz="0" w:val="nil"/>
-          <w:bottom w:space="0" w:sz="0" w:val="nil"/>
-          <w:right w:space="0" w:sz="0" w:val="nil"/>
-          <w:between w:space="0" w:sz="0" w:val="nil"/>
-        </w:pBdr>
-        <w:shd w:fill="auto" w:val="clear"/>
-        <w:rPr/>
-      </w:pPr>
-      <w:r>
-        <w:rPr>
-          <w:rtl w:val="0"/>
-        </w:rPr>
-        <w:t xml:space="preserve">To solve these issues, Project Solva implements a </w:t>
-      </w:r>
-      <w:r>
-        <w:rPr>
-          <w:b w:val="1"/>
-          <w:bCs w:val="1"/>
-          <w:rtl w:val="0"/>
-        </w:rPr>
-        <w:t xml:space="preserve">Multi-Tier Hybrid Routing Engine</w:t>
-      </w:r>
-      <w:r>
-        <w:rPr>
-          <w:rtl w:val="0"/>
-        </w:rPr>
-        <w:t xml:space="preserve">. It assumes that 99% of data is clean and should move at lightning speed, while the remaining 1% of anomalous data requires intelligent, asynchronous remediation.</w:t>
-      </w:r>
-    </w:p>
-    <w:p>
-      <w:pPr>
-        <w:pBdr>
-          <w:top w:space="0" w:sz="0" w:val="nil"/>
-          <w:left w:space="0" w:sz="0" w:val="nil"/>
-          <w:bottom w:space="0" w:sz="0" w:val="nil"/>
-          <w:right w:space="0" w:sz="0" w:val="nil"/>
-          <w:between w:space="0" w:sz="0" w:val="nil"/>
-        </w:pBdr>
-        <w:shd w:fill="auto" w:val="clear"/>
-        <w:rPr>
-          <w:b w:val="1"/>
-          <w:bCs w:val="1"/>
-        </w:rPr>
-      </w:pPr>
-      <w:r>
-        <w:rPr>
-          <w:b w:val="1"/>
-          <w:bCs w:val="1"/>
-          <w:rtl w:val="0"/>
-        </w:rPr>
-        <w:t xml:space="preserve">Core Principles:</w:t>
-      </w:r>
-    </w:p>
-    <w:p>
-      <w:pPr>
-        <w:numPr>
-          <w:ilvl w:val="0"/>
-          <w:numId w:val="5"/>
-        </w:numPr>
-        <w:pBdr>
-          <w:top w:space="0" w:sz="0" w:val="nil"/>
-          <w:left w:space="0" w:sz="0" w:val="nil"/>
-          <w:bottom w:space="0" w:sz="0" w:val="nil"/>
-          <w:right w:space="0" w:sz="0" w:val="nil"/>
-          <w:between w:space="0" w:sz="0" w:val="nil"/>
-        </w:pBdr>
-        <w:shd w:fill="auto" w:val="clear"/>
-        <w:ind w:left="600" w:hanging="360"/>
-        <w:rPr/>
-      </w:pPr>
-      <w:r>
-        <w:rPr>
-          <w:b w:val="1"/>
-          <w:bCs w:val="1"/>
-          <w:rtl w:val="0"/>
-        </w:rPr>
-        <w:t xml:space="preserve">Decoupling:</w:t>
-      </w:r>
-      <w:r>
-        <w:rPr>
-          <w:rtl w:val="0"/>
-        </w:rPr>
-        <w:t xml:space="preserve"> Never block the main ingestion pipeline.</w:t>
-      </w:r>
-    </w:p>
-    <w:p>
-      <w:pPr>
-        <w:numPr>
-          <w:ilvl w:val="0"/>
-          <w:numId w:val="5"/>
-        </w:numPr>
-        <w:pBdr>
-          <w:top w:space="0" w:sz="0" w:val="nil"/>
-          <w:left w:space="0" w:sz="0" w:val="nil"/>
-          <w:bottom w:space="0" w:sz="0" w:val="nil"/>
-          <w:right w:space="0" w:sz="0" w:val="nil"/>
-          <w:between w:space="0" w:sz="0" w:val="nil"/>
-        </w:pBdr>
-        <w:shd w:fill="auto" w:val="clear"/>
-        <w:ind w:left="600" w:hanging="360"/>
-        <w:rPr/>
-      </w:pPr>
-      <w:r>
-        <w:rPr>
-          <w:b w:val="1"/>
-          <w:bCs w:val="1"/>
-          <w:rtl w:val="0"/>
-        </w:rPr>
-        <w:t xml:space="preserve">Air-Gapped Security:</w:t>
-      </w:r>
-      <w:r>
-        <w:rPr>
-          <w:rtl w:val="0"/>
-        </w:rPr>
-        <w:t xml:space="preserve"> Zero external internet dependencies for AI inference.</w:t>
-      </w:r>
-    </w:p>
-    <w:p>
-      <w:pPr>
-        <w:numPr>
-          <w:ilvl w:val="0"/>
-          <w:numId w:val="5"/>
-        </w:numPr>
-        <w:pBdr>
-          <w:top w:space="0" w:sz="0" w:val="nil"/>
-          <w:left w:space="0" w:sz="0" w:val="nil"/>
-          <w:bottom w:space="0" w:sz="0" w:val="nil"/>
-          <w:right w:space="0" w:sz="0" w:val="nil"/>
-          <w:between w:space="0" w:sz="0" w:val="nil"/>
-        </w:pBdr>
-        <w:shd w:fill="auto" w:val="clear"/>
-        <w:ind w:left="600" w:hanging="360"/>
-        <w:rPr/>
-      </w:pPr>
-      <w:r>
-        <w:rPr>
-          <w:b w:val="1"/>
-          <w:bCs w:val="1"/>
-          <w:rtl w:val="0"/>
-        </w:rPr>
-        <w:t xml:space="preserve">Auto-Generation over Auto-Fixing:</w:t>
-      </w:r>
-      <w:r>
-        <w:rPr>
-          <w:rtl w:val="0"/>
-        </w:rPr>
-        <w:t xml:space="preserve"> The AI generates the </w:t>
-      </w:r>
-      <w:r>
-        <w:rPr>
-          <w:i w:val="1"/>
-          <w:iCs w:val="1"/>
-          <w:rtl w:val="0"/>
-        </w:rPr>
-        <w:t xml:space="preserve">logic</w:t>
-      </w:r>
-      <w:r>
-        <w:rPr>
-          <w:rtl w:val="0"/>
-        </w:rPr>
-        <w:t xml:space="preserve"> (code) to fix the data, not the fixed data itself.</w:t>
-      </w:r>
-    </w:p>
-    <w:p>
-      <w:pPr>
-        <w:numPr>
-          <w:ilvl w:val="0"/>
-          <w:numId w:val="5"/>
-        </w:numPr>
-        <w:pBdr>
-          <w:top w:space="0" w:sz="0" w:val="nil"/>
-          <w:left w:space="0" w:sz="0" w:val="nil"/>
-          <w:bottom w:space="0" w:sz="0" w:val="nil"/>
-          <w:right w:space="0" w:sz="0" w:val="nil"/>
-          <w:between w:space="0" w:sz="0" w:val="nil"/>
-        </w:pBdr>
-        <w:shd w:fill="auto" w:val="clear"/>
-        <w:ind w:left="600" w:hanging="360"/>
-        <w:rPr/>
-      </w:pPr>
-      <w:r>
-        <w:rPr>
-          <w:b w:val="1"/>
-          <w:bCs w:val="1"/>
-          <w:rtl w:val="0"/>
-        </w:rPr>
-        <w:t xml:space="preserve">Auditability:</w:t>
-      </w:r>
-      <w:r>
-        <w:rPr>
-          <w:rtl w:val="0"/>
-        </w:rPr>
-        <w:t xml:space="preserve"> Every transformation must be explainable and reversible.</w:t>
-      </w:r>
-    </w:p>
-    <w:p>
-      <w:pPr>
-        <w:pStyle w:val="Heading2"/>
-        <w:pBdr>
-          <w:top w:space="0" w:sz="0" w:val="nil"/>
-          <w:left w:space="0" w:sz="0" w:val="nil"/>
-          <w:bottom w:space="0" w:sz="0" w:val="nil"/>
-          <w:right w:space="0" w:sz="0" w:val="nil"/>
-          <w:between w:space="0" w:sz="0" w:val="nil"/>
-        </w:pBdr>
-        <w:shd w:fill="auto" w:val="clear"/>
-        <w:rPr/>
-      </w:pPr>
-      <w:r>
-        <w:rPr>
-          <w:rtl w:val="0"/>
-        </w:rPr>
-        <w:t xml:space="preserve">4. PHASE 1: INGESTION &amp; DETERMINISTIC GOVERNANCE</w:t>
-      </w:r>
-    </w:p>
-    <w:p>
-      <w:pPr>
-        <w:pBdr>
-          <w:top w:space="0" w:sz="0" w:val="nil"/>
-          <w:left w:space="0" w:sz="0" w:val="nil"/>
-          <w:bottom w:space="0" w:sz="0" w:val="nil"/>
-          <w:right w:space="0" w:sz="0" w:val="nil"/>
-          <w:between w:space="0" w:sz="0" w:val="nil"/>
-        </w:pBdr>
-        <w:shd w:fill="auto" w:val="clear"/>
         <w:spacing w:after="240" w:lineRule="auto"/>
         <w:rPr/>
       </w:pPr>
@@ -955,7 +2187,7 @@
         <w:rPr>
           <w:rtl w:val="0"/>
         </w:rPr>
-        <w:t xml:space="preserve">Before any AI is invoked, the system must enforce strict data contracts.</w:t>
+        <w:t xml:space="preserve">9. SYSTEM FLOW DIAGRAMS</w:t>
       </w:r>
     </w:p>
     <w:p>
@@ -976,1186 +2208,6 @@
         <w:rPr>
           <w:rtl w:val="0"/>
         </w:rPr>
-        <w:t xml:space="preserve">4.1. The Schema Diff Validator</w:t>
-      </w:r>
-    </w:p>
-    <w:p>
-      <w:pPr>
-        <w:pBdr>
-          <w:top w:space="0" w:sz="0" w:val="nil"/>
-          <w:left w:space="0" w:sz="0" w:val="nil"/>
-          <w:bottom w:space="0" w:sz="0" w:val="nil"/>
-          <w:right w:space="0" w:sz="0" w:val="nil"/>
-          <w:between w:space="0" w:sz="0" w:val="nil"/>
-        </w:pBdr>
-        <w:shd w:fill="auto" w:val="clear"/>
-        <w:rPr/>
-      </w:pPr>
-      <w:r>
-        <w:rPr>
-          <w:rtl w:val="0"/>
-        </w:rPr>
-        <w:t xml:space="preserve">Prior to data ingestion, the system compares the source schema signature with the target database schema.</w:t>
-      </w:r>
-    </w:p>
-    <w:p>
-      <w:pPr>
-        <w:numPr>
-          <w:ilvl w:val="0"/>
-          <w:numId w:val="6"/>
-        </w:numPr>
-        <w:pBdr>
-          <w:top w:space="0" w:sz="0" w:val="nil"/>
-          <w:left w:space="0" w:sz="0" w:val="nil"/>
-          <w:bottom w:space="0" w:sz="0" w:val="nil"/>
-          <w:right w:space="0" w:sz="0" w:val="nil"/>
-          <w:between w:space="0" w:sz="0" w:val="nil"/>
-        </w:pBdr>
-        <w:shd w:fill="auto" w:val="clear"/>
-        <w:ind w:left="600" w:hanging="360"/>
-        <w:rPr/>
-      </w:pPr>
-      <w:r>
-        <w:rPr>
-          <w:b w:val="1"/>
-          <w:bCs w:val="1"/>
-          <w:rtl w:val="0"/>
-        </w:rPr>
-        <w:t xml:space="preserve">Logic:</w:t>
-      </w:r>
-      <w:r>
-        <w:rPr>
-          <w:rtl w:val="0"/>
-        </w:rPr>
-        <w:t xml:space="preserve"> If Hash(Source_Schema) != Hash(Target_Schema) -&gt; Trigger Critical Alert.</w:t>
-      </w:r>
-    </w:p>
-    <w:p>
-      <w:pPr>
-        <w:numPr>
-          <w:ilvl w:val="0"/>
-          <w:numId w:val="6"/>
-        </w:numPr>
-        <w:pBdr>
-          <w:top w:space="0" w:sz="0" w:val="nil"/>
-          <w:left w:space="0" w:sz="0" w:val="nil"/>
-          <w:bottom w:space="0" w:sz="0" w:val="nil"/>
-          <w:right w:space="0" w:sz="0" w:val="nil"/>
-          <w:between w:space="0" w:sz="0" w:val="nil"/>
-        </w:pBdr>
-        <w:shd w:fill="auto" w:val="clear"/>
-        <w:ind w:left="600" w:hanging="360"/>
-        <w:rPr/>
-      </w:pPr>
-      <w:r>
-        <w:rPr>
-          <w:b w:val="1"/>
-          <w:bCs w:val="1"/>
-          <w:rtl w:val="0"/>
-        </w:rPr>
-        <w:t xml:space="preserve">Purpose:</w:t>
-      </w:r>
-      <w:r>
-        <w:rPr>
-          <w:rtl w:val="0"/>
-        </w:rPr>
-        <w:t xml:space="preserve"> Prevents pipeline destruction caused by upstream developers changing column types (e.g., changing an INT to a VARCHAR) without notifying the data team.</w:t>
-      </w:r>
-    </w:p>
-    <w:p>
-      <w:pPr>
-        <w:pStyle w:val="Heading3"/>
-        <w:pBdr>
-          <w:top w:space="0" w:sz="0" w:val="nil"/>
-          <w:left w:space="0" w:sz="0" w:val="nil"/>
-          <w:bottom w:space="0" w:sz="0" w:val="nil"/>
-          <w:right w:space="0" w:sz="0" w:val="nil"/>
-          <w:between w:space="0" w:sz="0" w:val="nil"/>
-        </w:pBdr>
-        <w:shd w:fill="auto" w:val="clear"/>
-        <w:rPr/>
-      </w:pPr>
-      <w:r>
-        <w:rPr>
-          <w:rtl w:val="0"/>
-        </w:rPr>
-        <w:t xml:space="preserve">4.2. The Deterministic Bouncer (Layer 1)</w:t>
-      </w:r>
-    </w:p>
-    <w:p>
-      <w:pPr>
-        <w:pBdr>
-          <w:top w:space="0" w:sz="0" w:val="nil"/>
-          <w:left w:space="0" w:sz="0" w:val="nil"/>
-          <w:bottom w:space="0" w:sz="0" w:val="nil"/>
-          <w:right w:space="0" w:sz="0" w:val="nil"/>
-          <w:between w:space="0" w:sz="0" w:val="nil"/>
-        </w:pBdr>
-        <w:shd w:fill="auto" w:val="clear"/>
-        <w:rPr/>
-      </w:pPr>
-      <w:r>
-        <w:rPr>
-          <w:rtl w:val="0"/>
-        </w:rPr>
-        <w:t xml:space="preserve">Data enters a high-speed Python/Polars validator.</w:t>
-      </w:r>
-    </w:p>
-    <w:p>
-      <w:pPr>
-        <w:numPr>
-          <w:ilvl w:val="0"/>
-          <w:numId w:val="7"/>
-        </w:numPr>
-        <w:pBdr>
-          <w:top w:space="0" w:sz="0" w:val="nil"/>
-          <w:left w:space="0" w:sz="0" w:val="nil"/>
-          <w:bottom w:space="0" w:sz="0" w:val="nil"/>
-          <w:right w:space="0" w:sz="0" w:val="nil"/>
-          <w:between w:space="0" w:sz="0" w:val="nil"/>
-        </w:pBdr>
-        <w:shd w:fill="auto" w:val="clear"/>
-        <w:ind w:left="600" w:hanging="360"/>
-        <w:rPr/>
-      </w:pPr>
-      <w:r>
-        <w:rPr>
-          <w:b w:val="1"/>
-          <w:bCs w:val="1"/>
-          <w:rtl w:val="0"/>
-        </w:rPr>
-        <w:t xml:space="preserve">The Fast Lane:</w:t>
-      </w:r>
-      <w:r>
-        <w:rPr>
-          <w:rtl w:val="0"/>
-        </w:rPr>
-        <w:t xml:space="preserve"> Data passing basic structural checks (Nulls, basic Regex) bypasses AI completely and is streamed directly to the Target Database.</w:t>
-      </w:r>
-    </w:p>
-    <w:p>
-      <w:pPr>
-        <w:numPr>
-          <w:ilvl w:val="0"/>
-          <w:numId w:val="7"/>
-        </w:numPr>
-        <w:pBdr>
-          <w:top w:space="0" w:sz="0" w:val="nil"/>
-          <w:left w:space="0" w:sz="0" w:val="nil"/>
-          <w:bottom w:space="0" w:sz="0" w:val="nil"/>
-          <w:right w:space="0" w:sz="0" w:val="nil"/>
-          <w:between w:space="0" w:sz="0" w:val="nil"/>
-        </w:pBdr>
-        <w:shd w:fill="auto" w:val="clear"/>
-        <w:ind w:left="600" w:hanging="360"/>
-        <w:rPr/>
-      </w:pPr>
-      <w:r>
-        <w:rPr>
-          <w:b w:val="1"/>
-          <w:bCs w:val="1"/>
-          <w:rtl w:val="0"/>
-        </w:rPr>
-        <w:t xml:space="preserve">The Suspect Queue:</w:t>
-      </w:r>
-      <w:r>
-        <w:rPr>
-          <w:rtl w:val="0"/>
-        </w:rPr>
-        <w:t xml:space="preserve"> Rows failing deterministic checks are tagged (Validation_Status = 'NEEDS_AI') and diverted.</w:t>
-      </w:r>
-    </w:p>
-    <w:p>
-      <w:pPr>
-        <w:pStyle w:val="Heading2"/>
-        <w:pBdr>
-          <w:top w:space="0" w:sz="0" w:val="nil"/>
-          <w:left w:space="0" w:sz="0" w:val="nil"/>
-          <w:bottom w:space="0" w:sz="0" w:val="nil"/>
-          <w:right w:space="0" w:sz="0" w:val="nil"/>
-          <w:between w:space="0" w:sz="0" w:val="nil"/>
-        </w:pBdr>
-        <w:shd w:fill="auto" w:val="clear"/>
-        <w:rPr/>
-      </w:pPr>
-      <w:r>
-        <w:rPr>
-          <w:rtl w:val="0"/>
-        </w:rPr>
-        <w:t xml:space="preserve">5. PHASE 2: ASYNCHRONOUS DECOUPLING &amp; SEMANTIC CLUSTERING</w:t>
-      </w:r>
-    </w:p>
-    <w:p>
-      <w:pPr>
-        <w:pBdr>
-          <w:top w:space="0" w:sz="0" w:val="nil"/>
-          <w:left w:space="0" w:sz="0" w:val="nil"/>
-          <w:bottom w:space="0" w:sz="0" w:val="nil"/>
-          <w:right w:space="0" w:sz="0" w:val="nil"/>
-          <w:between w:space="0" w:sz="0" w:val="nil"/>
-        </w:pBdr>
-        <w:shd w:fill="auto" w:val="clear"/>
-        <w:spacing w:after="240" w:lineRule="auto"/>
-        <w:rPr/>
-      </w:pPr>
-      <w:r>
-        <w:rPr>
-          <w:rtl w:val="0"/>
-        </w:rPr>
-        <w:t xml:space="preserve">To prevent OOM crashes when dealing with high-cardinality anomalies, we implement decoupling and compression.</w:t>
-      </w:r>
-    </w:p>
-    <w:p>
-      <w:pPr>
-        <w:pStyle w:val="Heading3"/>
-        <w:pBdr>
-          <w:top w:space="0" w:sz="0" w:val="nil"/>
-          <w:left w:space="0" w:sz="0" w:val="nil"/>
-          <w:bottom w:space="0" w:sz="0" w:val="nil"/>
-          <w:right w:space="0" w:sz="0" w:val="nil"/>
-          <w:between w:space="0" w:sz="0" w:val="nil"/>
-        </w:pBdr>
-        <w:shd w:fill="auto" w:val="clear"/>
-        <w:spacing w:before="0" w:lineRule="auto"/>
-        <w:rPr/>
-      </w:pPr>
-      <w:r>
-        <w:rPr>
-          <w:rtl w:val="0"/>
-        </w:rPr>
-        <w:t xml:space="preserve">5.1. The Message Queue</w:t>
-      </w:r>
-    </w:p>
-    <w:p>
-      <w:pPr>
-        <w:pBdr>
-          <w:top w:space="0" w:sz="0" w:val="nil"/>
-          <w:left w:space="0" w:sz="0" w:val="nil"/>
-          <w:bottom w:space="0" w:sz="0" w:val="nil"/>
-          <w:right w:space="0" w:sz="0" w:val="nil"/>
-          <w:between w:space="0" w:sz="0" w:val="nil"/>
-        </w:pBdr>
-        <w:shd w:fill="auto" w:val="clear"/>
-        <w:spacing w:after="240" w:lineRule="auto"/>
-        <w:rPr/>
-      </w:pPr>
-      <w:r>
-        <w:rPr>
-          <w:rtl w:val="0"/>
-        </w:rPr>
-        <w:t xml:space="preserve">Anomalous rows are pushed into an asynchronous message queue (Redis/RabbitMQ). The main ingestion pipeline finishes its task and spins down, ensuring 100% uptime.</w:t>
-      </w:r>
-    </w:p>
-    <w:p>
-      <w:pPr>
-        <w:pStyle w:val="Heading3"/>
-        <w:pBdr>
-          <w:top w:space="0" w:sz="0" w:val="nil"/>
-          <w:left w:space="0" w:sz="0" w:val="nil"/>
-          <w:bottom w:space="0" w:sz="0" w:val="nil"/>
-          <w:right w:space="0" w:sz="0" w:val="nil"/>
-          <w:between w:space="0" w:sz="0" w:val="nil"/>
-        </w:pBdr>
-        <w:shd w:fill="auto" w:val="clear"/>
-        <w:spacing w:before="0" w:lineRule="auto"/>
-        <w:rPr/>
-      </w:pPr>
-      <w:r>
-        <w:rPr>
-          <w:rtl w:val="0"/>
-        </w:rPr>
-        <w:t xml:space="preserve">5.2. Semantic Compression (ChromaDB)</w:t>
-      </w:r>
-    </w:p>
-    <w:p>
-      <w:pPr>
-        <w:pBdr>
-          <w:top w:space="0" w:sz="0" w:val="nil"/>
-          <w:left w:space="0" w:sz="0" w:val="nil"/>
-          <w:bottom w:space="0" w:sz="0" w:val="nil"/>
-          <w:right w:space="0" w:sz="0" w:val="nil"/>
-          <w:between w:space="0" w:sz="0" w:val="nil"/>
-        </w:pBdr>
-        <w:shd w:fill="auto" w:val="clear"/>
-        <w:rPr/>
-      </w:pPr>
-      <w:r>
-        <w:rPr>
-          <w:rtl w:val="0"/>
-        </w:rPr>
-        <w:t xml:space="preserve">Instead of treating 50,000 string errors as unique tasks, we utilize Vector Embeddings.</w:t>
-      </w:r>
-    </w:p>
-    <w:p>
-      <w:pPr>
-        <w:numPr>
-          <w:ilvl w:val="0"/>
-          <w:numId w:val="8"/>
-        </w:numPr>
-        <w:pBdr>
-          <w:top w:space="0" w:sz="0" w:val="nil"/>
-          <w:left w:space="0" w:sz="0" w:val="nil"/>
-          <w:bottom w:space="0" w:sz="0" w:val="nil"/>
-          <w:right w:space="0" w:sz="0" w:val="nil"/>
-          <w:between w:space="0" w:sz="0" w:val="nil"/>
-        </w:pBdr>
-        <w:shd w:fill="auto" w:val="clear"/>
-        <w:ind w:left="600" w:hanging="360"/>
-        <w:rPr/>
-      </w:pPr>
-      <w:r>
-        <w:rPr>
-          <w:b w:val="1"/>
-          <w:bCs w:val="1"/>
-          <w:rtl w:val="0"/>
-        </w:rPr>
-        <w:t xml:space="preserve">Mechanism:</w:t>
-      </w:r>
-      <w:r>
-        <w:rPr>
-          <w:rtl w:val="0"/>
-        </w:rPr>
-        <w:t xml:space="preserve"> Anomalies are embedded using a local lightweight embedding model. ChromaDB clusters these embeddings based on semantic similarity.</w:t>
-      </w:r>
-    </w:p>
-    <w:p>
-      <w:pPr>
-        <w:numPr>
-          <w:ilvl w:val="0"/>
-          <w:numId w:val="8"/>
-        </w:numPr>
-        <w:pBdr>
-          <w:top w:space="0" w:sz="0" w:val="nil"/>
-          <w:left w:space="0" w:sz="0" w:val="nil"/>
-          <w:bottom w:space="0" w:sz="0" w:val="nil"/>
-          <w:right w:space="0" w:sz="0" w:val="nil"/>
-          <w:between w:space="0" w:sz="0" w:val="nil"/>
-        </w:pBdr>
-        <w:shd w:fill="auto" w:val="clear"/>
-        <w:ind w:left="600" w:hanging="360"/>
-        <w:rPr/>
-      </w:pPr>
-      <w:r>
-        <w:rPr>
-          <w:b w:val="1"/>
-          <w:bCs w:val="1"/>
-          <w:rtl w:val="0"/>
-        </w:rPr>
-        <w:t xml:space="preserve">Result:</w:t>
-      </w:r>
-      <w:r>
-        <w:rPr>
-          <w:rtl w:val="0"/>
-        </w:rPr>
-        <w:t xml:space="preserve"> 50,000 textual errors (e.g., 50k variations of a wrong date format) are mathematically compressed into ~100 actionable Pattern Clusters.</w:t>
-      </w:r>
-    </w:p>
-    <w:p>
-      <w:pPr>
-        <w:pStyle w:val="Heading2"/>
-        <w:pBdr>
-          <w:top w:space="0" w:sz="0" w:val="nil"/>
-          <w:left w:space="0" w:sz="0" w:val="nil"/>
-          <w:bottom w:space="0" w:sz="0" w:val="nil"/>
-          <w:right w:space="0" w:sz="0" w:val="nil"/>
-          <w:between w:space="0" w:sz="0" w:val="nil"/>
-        </w:pBdr>
-        <w:shd w:fill="auto" w:val="clear"/>
-        <w:rPr/>
-      </w:pPr>
-      <w:r>
-        <w:rPr>
-          <w:rtl w:val="0"/>
-        </w:rPr>
-        <w:t xml:space="preserve">6. PHASE 3: AIR-GAPPED SLM REMEDIATION (The Engine)</w:t>
-      </w:r>
-    </w:p>
-    <w:p>
-      <w:pPr>
-        <w:pBdr>
-          <w:top w:space="0" w:sz="0" w:val="nil"/>
-          <w:left w:space="0" w:sz="0" w:val="nil"/>
-          <w:bottom w:space="0" w:sz="0" w:val="nil"/>
-          <w:right w:space="0" w:sz="0" w:val="nil"/>
-          <w:between w:space="0" w:sz="0" w:val="nil"/>
-        </w:pBdr>
-        <w:shd w:fill="auto" w:val="clear"/>
-        <w:spacing w:after="240" w:lineRule="auto"/>
-        <w:rPr/>
-      </w:pPr>
-      <w:r>
-        <w:rPr>
-          <w:rtl w:val="0"/>
-        </w:rPr>
-        <w:t xml:space="preserve">This phase represents the core intellectual property of Project Solva.</w:t>
-      </w:r>
-    </w:p>
-    <w:p>
-      <w:pPr>
-        <w:pStyle w:val="Heading3"/>
-        <w:pBdr>
-          <w:top w:space="0" w:sz="0" w:val="nil"/>
-          <w:left w:space="0" w:sz="0" w:val="nil"/>
-          <w:bottom w:space="0" w:sz="0" w:val="nil"/>
-          <w:right w:space="0" w:sz="0" w:val="nil"/>
-          <w:between w:space="0" w:sz="0" w:val="nil"/>
-        </w:pBdr>
-        <w:shd w:fill="auto" w:val="clear"/>
-        <w:spacing w:before="0" w:lineRule="auto"/>
-        <w:rPr/>
-      </w:pPr>
-      <w:r>
-        <w:rPr>
-          <w:rtl w:val="0"/>
-        </w:rPr>
-        <w:t xml:space="preserve">6.1. Metadata Extraction</w:t>
-      </w:r>
-    </w:p>
-    <w:p>
-      <w:pPr>
-        <w:pBdr>
-          <w:top w:space="0" w:sz="0" w:val="nil"/>
-          <w:left w:space="0" w:sz="0" w:val="nil"/>
-          <w:bottom w:space="0" w:sz="0" w:val="nil"/>
-          <w:right w:space="0" w:sz="0" w:val="nil"/>
-          <w:between w:space="0" w:sz="0" w:val="nil"/>
-        </w:pBdr>
-        <w:shd w:fill="auto" w:val="clear"/>
-        <w:spacing w:after="240" w:lineRule="auto"/>
-        <w:rPr/>
-      </w:pPr>
-      <w:r>
-        <w:rPr>
-          <w:rtl w:val="0"/>
-        </w:rPr>
-        <w:t xml:space="preserve">The background worker extracts a representative sample (Meta-data, typically 3-5 rows) from a specific ChromaDB cluster.</w:t>
-      </w:r>
-    </w:p>
-    <w:p>
-      <w:pPr>
-        <w:pStyle w:val="Heading3"/>
-        <w:pBdr>
-          <w:top w:space="0" w:sz="0" w:val="nil"/>
-          <w:left w:space="0" w:sz="0" w:val="nil"/>
-          <w:bottom w:space="0" w:sz="0" w:val="nil"/>
-          <w:right w:space="0" w:sz="0" w:val="nil"/>
-          <w:between w:space="0" w:sz="0" w:val="nil"/>
-        </w:pBdr>
-        <w:shd w:fill="auto" w:val="clear"/>
-        <w:spacing w:before="0" w:lineRule="auto"/>
-        <w:rPr/>
-      </w:pPr>
-      <w:r>
-        <w:rPr>
-          <w:rtl w:val="0"/>
-        </w:rPr>
-        <w:t xml:space="preserve">6.2. Transformation Template Restriction (The Sandbox)</w:t>
-      </w:r>
-    </w:p>
-    <w:p>
-      <w:pPr>
-        <w:pBdr>
-          <w:top w:space="0" w:sz="0" w:val="nil"/>
-          <w:left w:space="0" w:sz="0" w:val="nil"/>
-          <w:bottom w:space="0" w:sz="0" w:val="nil"/>
-          <w:right w:space="0" w:sz="0" w:val="nil"/>
-          <w:between w:space="0" w:sz="0" w:val="nil"/>
-        </w:pBdr>
-        <w:shd w:fill="auto" w:val="clear"/>
-        <w:rPr/>
-      </w:pPr>
-      <w:r>
-        <w:rPr>
-          <w:rtl w:val="0"/>
-        </w:rPr>
-        <w:t xml:space="preserve">The sample is passed to a local, air-gapped SLM (e.g., Llama-3 8B or Phi-3 via Ollama). The SLM is strictly prompted to output </w:t>
-      </w:r>
-      <w:r>
-        <w:rPr>
-          <w:i w:val="1"/>
-          <w:iCs w:val="1"/>
-          <w:rtl w:val="0"/>
-        </w:rPr>
-        <w:t xml:space="preserve">only</w:t>
-      </w:r>
-      <w:r>
-        <w:rPr>
-          <w:rtl w:val="0"/>
-        </w:rPr>
-        <w:t xml:space="preserve"> a sandboxed Pandas lambda function or a deterministic transformation rule.</w:t>
-      </w:r>
-    </w:p>
-    <w:p>
-      <w:pPr>
-        <w:numPr>
-          <w:ilvl w:val="0"/>
-          <w:numId w:val="9"/>
-        </w:numPr>
-        <w:pBdr>
-          <w:top w:space="0" w:sz="0" w:val="nil"/>
-          <w:left w:space="0" w:sz="0" w:val="nil"/>
-          <w:bottom w:space="0" w:sz="0" w:val="nil"/>
-          <w:right w:space="0" w:sz="0" w:val="nil"/>
-          <w:between w:space="0" w:sz="0" w:val="nil"/>
-        </w:pBdr>
-        <w:shd w:fill="auto" w:val="clear"/>
-        <w:ind w:left="600" w:hanging="360"/>
-        <w:rPr/>
-      </w:pPr>
-      <w:r>
-        <w:rPr>
-          <w:b w:val="1"/>
-          <w:bCs w:val="1"/>
-          <w:rtl w:val="0"/>
-        </w:rPr>
-        <w:t xml:space="preserve">Why:</w:t>
-      </w:r>
-      <w:r>
-        <w:rPr>
-          <w:rtl w:val="0"/>
-        </w:rPr>
-        <w:t xml:space="preserve"> We do not trust the AI to modify the data directly (which can lead to hallucinations). We trust the AI to suggest a mathematical function, which our system executes.</w:t>
-      </w:r>
-    </w:p>
-    <w:p>
-      <w:pPr>
-        <w:pStyle w:val="Heading3"/>
-        <w:pBdr>
-          <w:top w:space="0" w:sz="0" w:val="nil"/>
-          <w:left w:space="0" w:sz="0" w:val="nil"/>
-          <w:bottom w:space="0" w:sz="0" w:val="nil"/>
-          <w:right w:space="0" w:sz="0" w:val="nil"/>
-          <w:between w:space="0" w:sz="0" w:val="nil"/>
-        </w:pBdr>
-        <w:shd w:fill="auto" w:val="clear"/>
-        <w:rPr/>
-      </w:pPr>
-      <w:r>
-        <w:rPr>
-          <w:rtl w:val="0"/>
-        </w:rPr>
-        <w:t xml:space="preserve">6.3. Auto-Execution</w:t>
-      </w:r>
-    </w:p>
-    <w:p>
-      <w:pPr>
-        <w:pBdr>
-          <w:top w:space="0" w:sz="0" w:val="nil"/>
-          <w:left w:space="0" w:sz="0" w:val="nil"/>
-          <w:bottom w:space="0" w:sz="0" w:val="nil"/>
-          <w:right w:space="0" w:sz="0" w:val="nil"/>
-          <w:between w:space="0" w:sz="0" w:val="nil"/>
-        </w:pBdr>
-        <w:shd w:fill="auto" w:val="clear"/>
-        <w:spacing w:after="225" w:lineRule="auto"/>
-        <w:rPr/>
-      </w:pPr>
-      <w:r>
-        <w:rPr>
-          <w:rtl w:val="0"/>
-        </w:rPr>
-        <w:t xml:space="preserve">The system takes the AI-generated Python code and applies it across the entire cluster (e.g., all 45,000 rows matching that pattern) in milliseconds.</w:t>
-      </w:r>
-    </w:p>
-    <w:p>
-      <w:pPr>
-        <w:pStyle w:val="Heading2"/>
-        <w:pBdr>
-          <w:top w:space="0" w:sz="0" w:val="nil"/>
-          <w:left w:space="0" w:sz="0" w:val="nil"/>
-          <w:bottom w:space="0" w:sz="0" w:val="nil"/>
-          <w:right w:space="0" w:sz="0" w:val="nil"/>
-          <w:between w:space="0" w:sz="0" w:val="nil"/>
-        </w:pBdr>
-        <w:shd w:fill="auto" w:val="clear"/>
-        <w:spacing w:before="0" w:lineRule="auto"/>
-        <w:rPr/>
-      </w:pPr>
-      <w:r>
-        <w:rPr>
-          <w:rtl w:val="0"/>
-        </w:rPr>
-        <w:t xml:space="preserve">7. PHASE 4: ENTERPRISE SAFETY GUARDRAILS &amp; REVERSIBILITY</w:t>
-      </w:r>
-    </w:p>
-    <w:p>
-      <w:pPr>
-        <w:pBdr>
-          <w:top w:space="0" w:sz="0" w:val="nil"/>
-          <w:left w:space="0" w:sz="0" w:val="nil"/>
-          <w:bottom w:space="0" w:sz="0" w:val="nil"/>
-          <w:right w:space="0" w:sz="0" w:val="nil"/>
-          <w:between w:space="0" w:sz="0" w:val="nil"/>
-        </w:pBdr>
-        <w:shd w:fill="auto" w:val="clear"/>
-        <w:spacing w:after="240" w:lineRule="auto"/>
-        <w:rPr/>
-      </w:pPr>
-      <w:r>
-        <w:rPr>
-          <w:rtl w:val="0"/>
-        </w:rPr>
-        <w:t xml:space="preserve">An enterprise system must assume the AI will eventually make a mistake. Project Solva implements strict DataOps guardrails.</w:t>
-      </w:r>
-    </w:p>
-    <w:p>
-      <w:pPr>
-        <w:pStyle w:val="Heading3"/>
-        <w:pBdr>
-          <w:top w:space="0" w:sz="0" w:val="nil"/>
-          <w:left w:space="0" w:sz="0" w:val="nil"/>
-          <w:bottom w:space="0" w:sz="0" w:val="nil"/>
-          <w:right w:space="0" w:sz="0" w:val="nil"/>
-          <w:between w:space="0" w:sz="0" w:val="nil"/>
-        </w:pBdr>
-        <w:shd w:fill="auto" w:val="clear"/>
-        <w:spacing w:before="0" w:lineRule="auto"/>
-        <w:rPr/>
-      </w:pPr>
-      <w:r>
-        <w:rPr>
-          <w:rtl w:val="0"/>
-        </w:rPr>
-        <w:t xml:space="preserve">7.1. Hybrid Fingerprinting (Preventing False Positives)</w:t>
-      </w:r>
-    </w:p>
-    <w:p>
-      <w:pPr>
-        <w:pBdr>
-          <w:top w:space="0" w:sz="0" w:val="nil"/>
-          <w:left w:space="0" w:sz="0" w:val="nil"/>
-          <w:bottom w:space="0" w:sz="0" w:val="nil"/>
-          <w:right w:space="0" w:sz="0" w:val="nil"/>
-          <w:between w:space="0" w:sz="0" w:val="nil"/>
-        </w:pBdr>
-        <w:shd w:fill="auto" w:val="clear"/>
-        <w:rPr/>
-      </w:pPr>
-      <w:r>
-        <w:rPr>
-          <w:rtl w:val="0"/>
-        </w:rPr>
-        <w:t xml:space="preserve">Vector similarity is fuzzy. "John Doe ID:101" and "Jon Doe ID:102" might have a 99% similarity score.</w:t>
-      </w:r>
-    </w:p>
-    <w:p>
-      <w:pPr>
-        <w:numPr>
-          <w:ilvl w:val="0"/>
-          <w:numId w:val="10"/>
-        </w:numPr>
-        <w:pBdr>
-          <w:top w:space="0" w:sz="0" w:val="nil"/>
-          <w:left w:space="0" w:sz="0" w:val="nil"/>
-          <w:bottom w:space="0" w:sz="0" w:val="nil"/>
-          <w:right w:space="0" w:sz="0" w:val="nil"/>
-          <w:between w:space="0" w:sz="0" w:val="nil"/>
-        </w:pBdr>
-        <w:shd w:fill="auto" w:val="clear"/>
-        <w:ind w:left="600" w:hanging="360"/>
-        <w:rPr/>
-      </w:pPr>
-      <w:r>
-        <w:rPr>
-          <w:b w:val="1"/>
-          <w:bCs w:val="1"/>
-          <w:rtl w:val="0"/>
-        </w:rPr>
-        <w:t xml:space="preserve">Solution:</w:t>
-      </w:r>
-      <w:r>
-        <w:rPr>
-          <w:rtl w:val="0"/>
-        </w:rPr>
-        <w:t xml:space="preserve"> We combine Semantic Similarity with strict </w:t>
-      </w:r>
-      <w:r>
-        <w:rPr>
-          <w:b w:val="1"/>
-          <w:bCs w:val="1"/>
-          <w:rtl w:val="0"/>
-        </w:rPr>
-        <w:t xml:space="preserve">SHA-256 Hashes</w:t>
-      </w:r>
-      <w:r>
-        <w:rPr>
-          <w:rtl w:val="0"/>
-        </w:rPr>
-        <w:t xml:space="preserve"> for Primary Keys. If the PK hash differs, the records are forced into separate clusters, eliminating false merging.</w:t>
-      </w:r>
-    </w:p>
-    <w:p>
-      <w:pPr>
-        <w:pStyle w:val="Heading3"/>
-        <w:pBdr>
-          <w:top w:space="0" w:sz="0" w:val="nil"/>
-          <w:left w:space="0" w:sz="0" w:val="nil"/>
-          <w:bottom w:space="0" w:sz="0" w:val="nil"/>
-          <w:right w:space="0" w:sz="0" w:val="nil"/>
-          <w:between w:space="0" w:sz="0" w:val="nil"/>
-        </w:pBdr>
-        <w:shd w:fill="auto" w:val="clear"/>
-        <w:rPr/>
-      </w:pPr>
-      <w:r>
-        <w:rPr>
-          <w:rtl w:val="0"/>
-        </w:rPr>
-        <w:t xml:space="preserve">7.2. Safe Promotion &amp; Automated Testing</w:t>
-      </w:r>
-    </w:p>
-    <w:p>
-      <w:pPr>
-        <w:pBdr>
-          <w:top w:space="0" w:sz="0" w:val="nil"/>
-          <w:left w:space="0" w:sz="0" w:val="nil"/>
-          <w:bottom w:space="0" w:sz="0" w:val="nil"/>
-          <w:right w:space="0" w:sz="0" w:val="nil"/>
-          <w:between w:space="0" w:sz="0" w:val="nil"/>
-        </w:pBdr>
-        <w:shd w:fill="auto" w:val="clear"/>
-        <w:rPr/>
-      </w:pPr>
-      <w:r>
-        <w:rPr>
-          <w:rtl w:val="0"/>
-        </w:rPr>
-        <w:t xml:space="preserve">Fixed data is </w:t>
-      </w:r>
-      <w:r>
-        <w:rPr>
-          <w:b w:val="1"/>
-          <w:bCs w:val="1"/>
-          <w:rtl w:val="0"/>
-        </w:rPr>
-        <w:t xml:space="preserve">never</w:t>
-      </w:r>
-      <w:r>
-        <w:rPr>
-          <w:rtl w:val="0"/>
-        </w:rPr>
-        <w:t xml:space="preserve"> written directly to the production tables.</w:t>
-      </w:r>
-    </w:p>
-    <w:p>
-      <w:pPr>
-        <w:numPr>
-          <w:ilvl w:val="0"/>
-          <w:numId w:val="11"/>
-        </w:numPr>
-        <w:pBdr>
-          <w:top w:space="0" w:sz="0" w:val="nil"/>
-          <w:left w:space="0" w:sz="0" w:val="nil"/>
-          <w:bottom w:space="0" w:sz="0" w:val="nil"/>
-          <w:right w:space="0" w:sz="0" w:val="nil"/>
-          <w:between w:space="0" w:sz="0" w:val="nil"/>
-        </w:pBdr>
-        <w:shd w:fill="auto" w:val="clear"/>
-        <w:ind w:left="600" w:hanging="360"/>
-        <w:rPr/>
-      </w:pPr>
-      <w:r>
-        <w:rPr>
-          <w:b w:val="1"/>
-          <w:bCs w:val="1"/>
-          <w:rtl w:val="0"/>
-        </w:rPr>
-        <w:t xml:space="preserve">Staging:</w:t>
-      </w:r>
-      <w:r>
-        <w:rPr>
-          <w:rtl w:val="0"/>
-        </w:rPr>
-        <w:t xml:space="preserve"> Data is dumped into an isolated Staging Schema.</w:t>
-      </w:r>
-    </w:p>
-    <w:p>
-      <w:pPr>
-        <w:numPr>
-          <w:ilvl w:val="0"/>
-          <w:numId w:val="11"/>
-        </w:numPr>
-        <w:pBdr>
-          <w:top w:space="0" w:sz="0" w:val="nil"/>
-          <w:left w:space="0" w:sz="0" w:val="nil"/>
-          <w:bottom w:space="0" w:sz="0" w:val="nil"/>
-          <w:right w:space="0" w:sz="0" w:val="nil"/>
-          <w:between w:space="0" w:sz="0" w:val="nil"/>
-        </w:pBdr>
-        <w:shd w:fill="auto" w:val="clear"/>
-        <w:ind w:left="600" w:hanging="360"/>
-        <w:rPr/>
-      </w:pPr>
-      <w:r>
-        <w:rPr>
-          <w:b w:val="1"/>
-          <w:bCs w:val="1"/>
-          <w:rtl w:val="0"/>
-        </w:rPr>
-        <w:t xml:space="preserve">Validation:</w:t>
-      </w:r>
-      <w:r>
-        <w:rPr>
-          <w:rtl w:val="0"/>
-        </w:rPr>
-        <w:t xml:space="preserve"> Automated dbt (Data Build Tool) tests run against the staging data to verify business logic.</w:t>
-      </w:r>
-    </w:p>
-    <w:p>
-      <w:pPr>
-        <w:numPr>
-          <w:ilvl w:val="0"/>
-          <w:numId w:val="11"/>
-        </w:numPr>
-        <w:pBdr>
-          <w:top w:space="0" w:sz="0" w:val="nil"/>
-          <w:left w:space="0" w:sz="0" w:val="nil"/>
-          <w:bottom w:space="0" w:sz="0" w:val="nil"/>
-          <w:right w:space="0" w:sz="0" w:val="nil"/>
-          <w:between w:space="0" w:sz="0" w:val="nil"/>
-        </w:pBdr>
-        <w:shd w:fill="auto" w:val="clear"/>
-        <w:ind w:left="600" w:hanging="360"/>
-        <w:rPr/>
-      </w:pPr>
-      <w:r>
-        <w:rPr>
-          <w:b w:val="1"/>
-          <w:bCs w:val="1"/>
-          <w:rtl w:val="0"/>
-        </w:rPr>
-        <w:t xml:space="preserve">Promotion:</w:t>
-      </w:r>
-      <w:r>
-        <w:rPr>
-          <w:rtl w:val="0"/>
-        </w:rPr>
-        <w:t xml:space="preserve"> Only if all tests PASS is the data promoted to Production. If FAIL, the data is moved to a Human Quarantine Dashboard.</w:t>
-      </w:r>
-    </w:p>
-    <w:p>
-      <w:pPr>
-        <w:pStyle w:val="Heading3"/>
-        <w:pBdr>
-          <w:top w:space="0" w:sz="0" w:val="nil"/>
-          <w:left w:space="0" w:sz="0" w:val="nil"/>
-          <w:bottom w:space="0" w:sz="0" w:val="nil"/>
-          <w:right w:space="0" w:sz="0" w:val="nil"/>
-          <w:between w:space="0" w:sz="0" w:val="nil"/>
-        </w:pBdr>
-        <w:shd w:fill="auto" w:val="clear"/>
-        <w:rPr/>
-      </w:pPr>
-      <w:r>
-        <w:rPr>
-          <w:rtl w:val="0"/>
-        </w:rPr>
-        <w:t xml:space="preserve">7.3. Explainable AI (XAI) &amp; Audit Logging</w:t>
-      </w:r>
-    </w:p>
-    <w:p>
-      <w:pPr>
-        <w:pBdr>
-          <w:top w:space="0" w:sz="0" w:val="nil"/>
-          <w:left w:space="0" w:sz="0" w:val="nil"/>
-          <w:bottom w:space="0" w:sz="0" w:val="nil"/>
-          <w:right w:space="0" w:sz="0" w:val="nil"/>
-          <w:between w:space="0" w:sz="0" w:val="nil"/>
-        </w:pBdr>
-        <w:shd w:fill="auto" w:val="clear"/>
-        <w:spacing w:after="240" w:lineRule="auto"/>
-        <w:rPr/>
-      </w:pPr>
-      <w:r>
-        <w:rPr>
-          <w:rtl w:val="0"/>
-        </w:rPr>
-        <w:t xml:space="preserve">The SLM must return a JSON object containing a confidence_score and reasoning. Every modification is logged in an Audit Table: [Row_ID, Old_Value, New_Value, AI_Reason, Confidence_Score, Model_Version, Timestamp]</w:t>
-      </w:r>
-    </w:p>
-    <w:p>
-      <w:pPr>
-        <w:pStyle w:val="Heading3"/>
-        <w:pBdr>
-          <w:top w:space="0" w:sz="0" w:val="nil"/>
-          <w:left w:space="0" w:sz="0" w:val="nil"/>
-          <w:bottom w:space="0" w:sz="0" w:val="nil"/>
-          <w:right w:space="0" w:sz="0" w:val="nil"/>
-          <w:between w:space="0" w:sz="0" w:val="nil"/>
-        </w:pBdr>
-        <w:shd w:fill="auto" w:val="clear"/>
-        <w:spacing w:before="0" w:lineRule="auto"/>
-        <w:rPr/>
-      </w:pPr>
-      <w:r>
-        <w:rPr>
-          <w:rtl w:val="0"/>
-        </w:rPr>
-        <w:t xml:space="preserve">7.4. Zero-Data-Loss Reconciliation Check</w:t>
-      </w:r>
-    </w:p>
-    <w:p>
-      <w:pPr>
-        <w:pBdr>
-          <w:top w:space="0" w:sz="0" w:val="nil"/>
-          <w:left w:space="0" w:sz="0" w:val="nil"/>
-          <w:bottom w:space="0" w:sz="0" w:val="nil"/>
-          <w:right w:space="0" w:sz="0" w:val="nil"/>
-          <w:between w:space="0" w:sz="0" w:val="nil"/>
-        </w:pBdr>
-        <w:shd w:fill="auto" w:val="clear"/>
-        <w:spacing w:after="225" w:lineRule="auto"/>
-        <w:rPr/>
-      </w:pPr>
-      <w:r>
-        <w:rPr>
-          <w:rtl w:val="0"/>
-        </w:rPr>
-        <w:t xml:space="preserve">At the end of every batch run, the system executes an immutable mathematical check: Total_Source_Rows == (Snowflake_Success_Rows + Quarantine_Rows) Any mismatch &gt; 0 triggers an immediate webhook alert.</w:t>
-      </w:r>
-    </w:p>
-    <w:p>
-      <w:pPr>
-        <w:pStyle w:val="Heading2"/>
-        <w:pBdr>
-          <w:top w:space="0" w:sz="0" w:val="nil"/>
-          <w:left w:space="0" w:sz="0" w:val="nil"/>
-          <w:bottom w:space="0" w:sz="0" w:val="nil"/>
-          <w:right w:space="0" w:sz="0" w:val="nil"/>
-          <w:between w:space="0" w:sz="0" w:val="nil"/>
-        </w:pBdr>
-        <w:shd w:fill="auto" w:val="clear"/>
-        <w:spacing w:before="0" w:lineRule="auto"/>
-        <w:rPr/>
-      </w:pPr>
-      <w:r>
-        <w:rPr>
-          <w:rtl w:val="0"/>
-        </w:rPr>
-        <w:t xml:space="preserve">8. THE "DOOMSDAY" FALLBACK (Circuit Breaker)</w:t>
-      </w:r>
-    </w:p>
-    <w:p>
-      <w:pPr>
-        <w:pBdr>
-          <w:top w:space="0" w:sz="0" w:val="nil"/>
-          <w:left w:space="0" w:sz="0" w:val="nil"/>
-          <w:bottom w:space="0" w:sz="0" w:val="nil"/>
-          <w:right w:space="0" w:sz="0" w:val="nil"/>
-          <w:between w:space="0" w:sz="0" w:val="nil"/>
-        </w:pBdr>
-        <w:shd w:fill="auto" w:val="clear"/>
-        <w:rPr/>
-      </w:pPr>
-      <w:r>
-        <w:rPr>
-          <w:b w:val="1"/>
-          <w:bCs w:val="1"/>
-          <w:rtl w:val="0"/>
-        </w:rPr>
-        <w:t xml:space="preserve">Scenario:</w:t>
-      </w:r>
-      <w:r>
-        <w:rPr>
-          <w:rtl w:val="0"/>
-        </w:rPr>
-        <w:t xml:space="preserve"> Schema Drift occurs simultaneously with a panic in the deterministic layer, and the local SLM goes offline.</w:t>
-      </w:r>
-    </w:p>
-    <w:p>
-      <w:pPr>
-        <w:pBdr>
-          <w:top w:space="0" w:sz="0" w:val="nil"/>
-          <w:left w:space="0" w:sz="0" w:val="nil"/>
-          <w:bottom w:space="0" w:sz="0" w:val="nil"/>
-          <w:right w:space="0" w:sz="0" w:val="nil"/>
-          <w:between w:space="0" w:sz="0" w:val="nil"/>
-        </w:pBdr>
-        <w:shd w:fill="auto" w:val="clear"/>
-        <w:rPr/>
-      </w:pPr>
-      <w:r>
-        <w:rPr>
-          <w:b w:val="1"/>
-          <w:bCs w:val="1"/>
-          <w:rtl w:val="0"/>
-        </w:rPr>
-        <w:t xml:space="preserve">Fallback Execution:</w:t>
-      </w:r>
-      <w:r>
-        <w:rPr>
-          <w:rtl w:val="0"/>
-        </w:rPr>
-        <w:t xml:space="preserve"> The system shifts from Remediation to Absolute Preservation.</w:t>
-      </w:r>
-    </w:p>
-    <w:p>
-      <w:pPr>
-        <w:numPr>
-          <w:ilvl w:val="0"/>
-          <w:numId w:val="2"/>
-        </w:numPr>
-        <w:pBdr>
-          <w:top w:space="0" w:sz="0" w:val="nil"/>
-          <w:left w:space="0" w:sz="0" w:val="nil"/>
-          <w:bottom w:space="0" w:sz="0" w:val="nil"/>
-          <w:right w:space="0" w:sz="0" w:val="nil"/>
-          <w:between w:space="0" w:sz="0" w:val="nil"/>
-        </w:pBdr>
-        <w:shd w:fill="auto" w:val="clear"/>
-        <w:ind w:left="600" w:hanging="360"/>
-        <w:rPr/>
-      </w:pPr>
-      <w:r>
-        <w:rPr>
-          <w:b w:val="1"/>
-          <w:bCs w:val="1"/>
-          <w:rtl w:val="0"/>
-        </w:rPr>
-        <w:t xml:space="preserve">Trip the Circuit Breaker:</w:t>
-      </w:r>
-      <w:r>
-        <w:rPr>
-          <w:rtl w:val="0"/>
-        </w:rPr>
-        <w:t xml:space="preserve"> Ingestion for the failing stream is instantly halted to isolate the blast radius.</w:t>
-      </w:r>
-    </w:p>
-    <w:p>
-      <w:pPr>
-        <w:numPr>
-          <w:ilvl w:val="0"/>
-          <w:numId w:val="2"/>
-        </w:numPr>
-        <w:pBdr>
-          <w:top w:space="0" w:sz="0" w:val="nil"/>
-          <w:left w:space="0" w:sz="0" w:val="nil"/>
-          <w:bottom w:space="0" w:sz="0" w:val="nil"/>
-          <w:right w:space="0" w:sz="0" w:val="nil"/>
-          <w:between w:space="0" w:sz="0" w:val="nil"/>
-        </w:pBdr>
-        <w:shd w:fill="auto" w:val="clear"/>
-        <w:ind w:left="600" w:hanging="360"/>
-        <w:rPr/>
-      </w:pPr>
-      <w:r>
-        <w:rPr>
-          <w:b w:val="1"/>
-          <w:bCs w:val="1"/>
-          <w:rtl w:val="0"/>
-        </w:rPr>
-        <w:t xml:space="preserve">Immutable Raw Vault:</w:t>
-      </w:r>
-      <w:r>
-        <w:rPr>
-          <w:rtl w:val="0"/>
-        </w:rPr>
-        <w:t xml:space="preserve"> The unparseable payload is serialized into raw bytes (JSON/Parquet) and dumped into an immutable Cold Storage Bucket (AWS S3) or Dead Letter Queue (DLQ).</w:t>
-      </w:r>
-    </w:p>
-    <w:p>
-      <w:pPr>
-        <w:numPr>
-          <w:ilvl w:val="0"/>
-          <w:numId w:val="2"/>
-        </w:numPr>
-        <w:pBdr>
-          <w:top w:space="0" w:sz="0" w:val="nil"/>
-          <w:left w:space="0" w:sz="0" w:val="nil"/>
-          <w:bottom w:space="0" w:sz="0" w:val="nil"/>
-          <w:right w:space="0" w:sz="0" w:val="nil"/>
-          <w:between w:space="0" w:sz="0" w:val="nil"/>
-        </w:pBdr>
-        <w:shd w:fill="auto" w:val="clear"/>
-        <w:ind w:left="600" w:hanging="360"/>
-        <w:rPr/>
-      </w:pPr>
-      <w:r>
-        <w:rPr>
-          <w:b w:val="1"/>
-          <w:bCs w:val="1"/>
-          <w:rtl w:val="0"/>
-        </w:rPr>
-        <w:t xml:space="preserve">Sev-1 Escalation:</w:t>
-      </w:r>
-      <w:r>
-        <w:rPr>
-          <w:rtl w:val="0"/>
-        </w:rPr>
-        <w:t xml:space="preserve"> An alert containing the stack trace and the S3 URI is fired to PagerDuty.</w:t>
-      </w:r>
-    </w:p>
-    <w:p>
-      <w:pPr>
-        <w:numPr>
-          <w:ilvl w:val="0"/>
-          <w:numId w:val="2"/>
-        </w:numPr>
-        <w:pBdr>
-          <w:top w:space="0" w:sz="0" w:val="nil"/>
-          <w:left w:space="0" w:sz="0" w:val="nil"/>
-          <w:bottom w:space="0" w:sz="0" w:val="nil"/>
-          <w:right w:space="0" w:sz="0" w:val="nil"/>
-          <w:between w:space="0" w:sz="0" w:val="nil"/>
-        </w:pBdr>
-        <w:shd w:fill="auto" w:val="clear"/>
-        <w:ind w:left="600" w:hanging="360"/>
-        <w:rPr/>
-      </w:pPr>
-      <w:r>
-        <w:rPr>
-          <w:b w:val="1"/>
-          <w:bCs w:val="1"/>
-          <w:rtl w:val="0"/>
-        </w:rPr>
-        <w:t xml:space="preserve">Replayability:</w:t>
-      </w:r>
-      <w:r>
-        <w:rPr>
-          <w:rtl w:val="0"/>
-        </w:rPr>
-        <w:t xml:space="preserve"> Engineers can manually fix the logic and replay the raw S3 payload back into the pipeline, guaranteeing zero data loss even during a total system failure.</w:t>
-      </w:r>
-    </w:p>
-    <w:p>
-      <w:pPr>
-        <w:pStyle w:val="Heading2"/>
-        <w:pBdr>
-          <w:top w:space="0" w:sz="0" w:val="nil"/>
-          <w:left w:space="0" w:sz="0" w:val="nil"/>
-          <w:bottom w:space="0" w:sz="0" w:val="nil"/>
-          <w:right w:space="0" w:sz="0" w:val="nil"/>
-          <w:between w:space="0" w:sz="0" w:val="nil"/>
-        </w:pBdr>
-        <w:shd w:fill="auto" w:val="clear"/>
-        <w:spacing w:after="240" w:lineRule="auto"/>
-        <w:rPr/>
-      </w:pPr>
-      <w:r>
-        <w:rPr>
-          <w:rtl w:val="0"/>
-        </w:rPr>
-        <w:t xml:space="preserve">9. SYSTEM FLOW DIAGRAMS</w:t>
-      </w:r>
-    </w:p>
-    <w:p>
-      <w:pPr>
-        <w:pStyle w:val="Heading3"/>
-        <w:pBdr>
-          <w:top w:space="0" w:sz="0" w:val="nil"/>
-          <w:left w:space="0" w:sz="0" w:val="nil"/>
-          <w:bottom w:space="0" w:sz="0" w:val="nil"/>
-          <w:right w:space="0" w:sz="0" w:val="nil"/>
-          <w:between w:space="0" w:sz="0" w:val="nil"/>
-        </w:pBdr>
-        <w:shd w:fill="auto" w:val="clear"/>
-        <w:spacing w:before="0" w:lineRule="auto"/>
-        <w:rPr/>
-      </w:pPr>
-      <w:r>
-        <w:rPr>
-          <w:rtl w:val="0"/>
-        </w:rPr>
         <w:t xml:space="preserve">9.1. Core Architectural Flow</w:t>
       </w:r>
       <w:r>
@@ -2169,7 +2221,7 @@
           <wp:inline distB="114300" distT="114300" distL="114300" distR="114300">
             <wp:extent cx="4948976" cy="7013954"/>
             <wp:effectExtent b="0" l="0" r="0" t="0"/>
-            <wp:docPr id="1" name="image1.png"/>
+            <wp:docPr id="2" name="image1.png"/>
             <a:graphic>
               <a:graphicData uri="http://schemas.openxmlformats.org/drawingml/2006/picture">
                 <pic:pic>
@@ -2178,7 +2230,7 @@
                     <pic:cNvPicPr preferRelativeResize="0"/>
                   </pic:nvPicPr>
                   <pic:blipFill>
-                    <a:blip r:embed="rId16"/>
+                    <a:blip r:embed="rId17"/>
                     <a:srcRect b="0" l="0" r="0" t="0"/>
                     <a:stretch>
                       <a:fillRect/>
@@ -2775,15 +2827,23 @@
           <w:szCs w:val="20"/>
         </w:rPr>
       </w:pPr>
-      <w:r>
-        <w:rPr>
-          <w:rFonts w:ascii="Arial Unicode MS" w:cs="Arial Unicode MS" w:eastAsia="Arial Unicode MS" w:hAnsi="Arial Unicode MS"/>
-          <w:sz w:val="20"/>
-          <w:szCs w:val="20"/>
-          <w:rtl w:val="0"/>
-        </w:rPr>
-        <w:t xml:space="preserve">│   └── phase6_promotion.py         # Staging → production</w:t>
-      </w:r>
+      <w:sdt>
+        <w:sdtPr>
+          <w:id w:val="1541144365"/>
+          <w:tag w:val="goog_rdk_0"/>
+        </w:sdtPr>
+        <w:sdtContent>
+          <w:r>
+            <w:rPr>
+              <w:rFonts w:ascii="Arial Unicode MS" w:cs="Arial Unicode MS" w:eastAsia="Arial Unicode MS" w:hAnsi="Arial Unicode MS"/>
+              <w:sz w:val="20"/>
+              <w:szCs w:val="20"/>
+              <w:rtl w:val="0"/>
+            </w:rPr>
+            <w:t xml:space="preserve">│   └── phase6_promotion.py         # Staging → production</w:t>
+          </w:r>
+        </w:sdtContent>
+      </w:sdt>
       <w:r>
         <w:rPr>
           <w:rtl w:val="0"/>
@@ -3090,7 +3150,76 @@
       <w:pPr>
         <w:numPr>
           <w:ilvl w:val="0"/>
-          <w:numId w:val="3"/>
+          <w:numId w:val="5"/>
+        </w:numPr>
+        <w:ind w:left="600" w:hanging="360"/>
+      </w:pPr>
+      <w:r>
+        <w:rPr>
+          <w:b w:val="1"/>
+          <w:bCs w:val="1"/>
+          <w:rtl w:val="0"/>
+        </w:rPr>
+        <w:t xml:space="preserve">Resource Efficiency:</w:t>
+      </w:r>
+      <w:r>
+        <w:rPr>
+          <w:rtl w:val="0"/>
+        </w:rPr>
+        <w:t xml:space="preserve"> Eliminates external API dependencies and reduces compute overhead through semantic clustering mechanisms.</w:t>
+      </w:r>
+    </w:p>
+    <w:p>
+      <w:pPr>
+        <w:numPr>
+          <w:ilvl w:val="0"/>
+          <w:numId w:val="5"/>
+        </w:numPr>
+        <w:ind w:left="600" w:hanging="360"/>
+      </w:pPr>
+      <w:r>
+        <w:rPr>
+          <w:b w:val="1"/>
+          <w:bCs w:val="1"/>
+          <w:rtl w:val="0"/>
+        </w:rPr>
+        <w:t xml:space="preserve">Regulatory Compliance:</w:t>
+      </w:r>
+      <w:r>
+        <w:rPr>
+          <w:rtl w:val="0"/>
+        </w:rPr>
+        <w:t xml:space="preserve"> Maintains complete data sovereignty, as PII never exits the localized boundary environment.</w:t>
+      </w:r>
+    </w:p>
+    <w:p>
+      <w:pPr>
+        <w:numPr>
+          <w:ilvl w:val="0"/>
+          <w:numId w:val="5"/>
+        </w:numPr>
+        <w:ind w:left="600" w:hanging="360"/>
+      </w:pPr>
+      <w:r>
+        <w:rPr>
+          <w:b w:val="1"/>
+          <w:bCs w:val="1"/>
+          <w:rtl w:val="0"/>
+        </w:rPr>
+        <w:t xml:space="preserve">System Resilience:</w:t>
+      </w:r>
+      <w:r>
+        <w:rPr>
+          <w:rtl w:val="0"/>
+        </w:rPr>
+        <w:t xml:space="preserve"> Integrated circuit breaker mechanisms and immutable raw storage backings ensure zero-data-loss guarantees and guard against production storage corruption.</w:t>
+      </w:r>
+    </w:p>
+    <w:p>
+      <w:pPr>
+        <w:numPr>
+          <w:ilvl w:val="0"/>
+          <w:numId w:val="5"/>
         </w:numPr>
         <w:pBdr>
           <w:top w:space="0" w:sz="0" w:val="nil"/>
@@ -3109,21 +3238,22 @@
           <w:bCs w:val="1"/>
           <w:rtl w:val="0"/>
         </w:rPr>
-        <w:t xml:space="preserve">Cost Efficiency:</w:t>
-      </w:r>
-      <w:r>
-        <w:rPr>
-          <w:rtl w:val="0"/>
-        </w:rPr>
-        <w:t xml:space="preserve"> $0 external API costs and minimal compute overhead due to Semantic Clustering.</w:t>
-      </w:r>
-    </w:p>
-    <w:p>
-      <w:pPr>
-        <w:numPr>
-          <w:ilvl w:val="0"/>
-          <w:numId w:val="3"/>
-        </w:numPr>
+        <w:t xml:space="preserve">Operational Velocity:</w:t>
+      </w:r>
+      <w:r>
+        <w:rPr>
+          <w:rtl w:val="0"/>
+        </w:rPr>
+        <w:t xml:space="preserve"> Reduces manual script maintenance requirement by up to 90%, enabling engineering focus on core system architecture.</w:t>
+      </w:r>
+      <w:r>
+        <w:rPr>
+          <w:rtl w:val="0"/>
+        </w:rPr>
+      </w:r>
+    </w:p>
+    <w:p>
+      <w:pPr>
         <w:pBdr>
           <w:top w:space="0" w:sz="0" w:val="nil"/>
           <w:left w:space="0" w:sz="0" w:val="nil"/>
@@ -3132,110 +3262,30 @@
           <w:between w:space="0" w:sz="0" w:val="nil"/>
         </w:pBdr>
         <w:shd w:fill="auto" w:val="clear"/>
-        <w:ind w:left="600" w:hanging="360"/>
-        <w:rPr/>
-      </w:pPr>
-      <w:r>
-        <w:rPr>
-          <w:b w:val="1"/>
-          <w:bCs w:val="1"/>
-          <w:rtl w:val="0"/>
-        </w:rPr>
-        <w:t xml:space="preserve">Compliance:</w:t>
-      </w:r>
-      <w:r>
-        <w:rPr>
-          <w:rtl w:val="0"/>
-        </w:rPr>
-        <w:t xml:space="preserve"> 100% Data Sovereignty as PII never leaves the local network.</w:t>
-      </w:r>
-    </w:p>
-    <w:p>
-      <w:pPr>
-        <w:numPr>
-          <w:ilvl w:val="0"/>
-          <w:numId w:val="3"/>
-        </w:numPr>
-        <w:pBdr>
-          <w:top w:space="0" w:sz="0" w:val="nil"/>
-          <w:left w:space="0" w:sz="0" w:val="nil"/>
-          <w:bottom w:space="0" w:sz="0" w:val="nil"/>
-          <w:right w:space="0" w:sz="0" w:val="nil"/>
-          <w:between w:space="0" w:sz="0" w:val="nil"/>
-        </w:pBdr>
-        <w:shd w:fill="auto" w:val="clear"/>
-        <w:ind w:left="600" w:hanging="360"/>
-        <w:rPr/>
-      </w:pPr>
-      <w:r>
-        <w:rPr>
-          <w:b w:val="1"/>
-          <w:bCs w:val="1"/>
-          <w:rtl w:val="0"/>
-        </w:rPr>
-        <w:t xml:space="preserve">Resilience:</w:t>
-      </w:r>
-      <w:r>
-        <w:rPr>
-          <w:rtl w:val="0"/>
-        </w:rPr>
-        <w:t xml:space="preserve"> The Circuit Breaker and Immutable Raw Vault guarantee zero data loss and eliminate the risk of production corruption.</w:t>
-      </w:r>
-    </w:p>
-    <w:p>
-      <w:pPr>
-        <w:numPr>
-          <w:ilvl w:val="0"/>
-          <w:numId w:val="3"/>
-        </w:numPr>
-        <w:pBdr>
-          <w:top w:space="0" w:sz="0" w:val="nil"/>
-          <w:left w:space="0" w:sz="0" w:val="nil"/>
-          <w:bottom w:space="0" w:sz="0" w:val="nil"/>
-          <w:right w:space="0" w:sz="0" w:val="nil"/>
-          <w:between w:space="0" w:sz="0" w:val="nil"/>
-        </w:pBdr>
-        <w:shd w:fill="auto" w:val="clear"/>
-        <w:ind w:left="600" w:hanging="360"/>
-        <w:rPr/>
-      </w:pPr>
-      <w:r>
-        <w:rPr>
-          <w:b w:val="1"/>
-          <w:bCs w:val="1"/>
-          <w:rtl w:val="0"/>
-        </w:rPr>
-        <w:t xml:space="preserve">Engineering Velocity:</w:t>
-      </w:r>
-      <w:r>
-        <w:rPr>
-          <w:rtl w:val="0"/>
-        </w:rPr>
-        <w:t xml:space="preserve"> Eliminates 90% of manual SQL script maintenance, freeing Data Engineers to focus on architecture rather than plumbing.</w:t>
-      </w:r>
-    </w:p>
-    <w:p>
-      <w:pPr>
-        <w:pBdr>
-          <w:top w:space="0" w:sz="0" w:val="nil"/>
-          <w:left w:space="0" w:sz="0" w:val="nil"/>
-          <w:bottom w:space="0" w:sz="0" w:val="nil"/>
-          <w:right w:space="0" w:sz="0" w:val="nil"/>
-          <w:between w:space="0" w:sz="0" w:val="nil"/>
-        </w:pBdr>
-        <w:shd w:fill="auto" w:val="clear"/>
-        <w:rPr/>
-      </w:pPr>
-      <w:r>
-        <w:rPr>
-          <w:rtl w:val="0"/>
-        </w:rPr>
-        <w:t xml:space="preserve">Project Solva is not just a migration tool; it is a self-healing data ecosystem built for enterprise scale.</w:t>
+        <w:rPr/>
+      </w:pPr>
+      <w:r>
+        <w:rPr>
+          <w:rtl w:val="0"/>
+        </w:rPr>
+        <w:t xml:space="preserve">Project Solva </w:t>
+      </w:r>
+      <w:r>
+        <w:rPr>
+          <w:rtl w:val="0"/>
+        </w:rPr>
+        <w:t xml:space="preserve">provides a robust framework for autonomous data quality management and continuous pipeline resilience in enterprise environments</w:t>
+      </w:r>
+      <w:r>
+        <w:rPr>
+          <w:rtl w:val="0"/>
+        </w:rPr>
+        <w:t xml:space="preserve">.</w:t>
       </w:r>
     </w:p>
     <w:sectPr>
-      <w:headerReference r:id="rId17" w:type="default"/>
-      <w:footerReference r:id="rId18" w:type="default"/>
+      <w:headerReference r:id="rId18" w:type="default"/>
+      <w:footerReference r:id="rId19" w:type="default"/>
       <w:pgSz w:h="15840" w:w="12240" w:orient="portrait"/>
       <w:pgMar w:bottom="1440" w:top="1440" w:left="1440" w:right="1440" w:header="0" w:footer="720"/>
       <w:pgNumType w:start="1"/>
@@ -3497,8 +3547,8 @@
   <w:abstractNum w:abstractNumId="2">
     <w:lvl w:ilvl="0">
       <w:start w:val="1"/>
-      <w:numFmt w:val="decimal"/>
-      <w:lvlText w:val="%1."/>
+      <w:numFmt w:val="bullet"/>
+      <w:lvlText w:val="●"/>
       <w:lvlJc w:val="left"/>
       <w:pPr>
         <w:ind w:left="600" w:hanging="360"/>
@@ -4151,8 +4201,8 @@
   <w:abstractNum w:abstractNumId="5">
     <w:lvl w:ilvl="0">
       <w:start w:val="1"/>
-      <w:numFmt w:val="bullet"/>
-      <w:lvlText w:val="●"/>
+      <w:numFmt w:val="decimal"/>
+      <w:lvlText w:val="%1."/>
       <w:lvlJc w:val="left"/>
       <w:pPr>
         <w:ind w:left="600" w:hanging="360"/>
@@ -4369,8 +4419,8 @@
   <w:abstractNum w:abstractNumId="6">
     <w:lvl w:ilvl="0">
       <w:start w:val="1"/>
-      <w:numFmt w:val="bullet"/>
-      <w:lvlText w:val="●"/>
+      <w:numFmt w:val="decimal"/>
+      <w:lvlText w:val="%1."/>
       <w:lvlJc w:val="left"/>
       <w:pPr>
         <w:ind w:left="600" w:hanging="360"/>
@@ -5459,8 +5509,8 @@
   <w:abstractNum w:abstractNumId="11">
     <w:lvl w:ilvl="0">
       <w:start w:val="1"/>
-      <w:numFmt w:val="decimal"/>
-      <w:lvlText w:val="%1."/>
+      <w:numFmt w:val="bullet"/>
+      <w:lvlText w:val="●"/>
       <w:lvlJc w:val="left"/>
       <w:pPr>
         <w:ind w:left="600" w:hanging="360"/>
@@ -5900,6 +5950,20 @@
       <w:sz w:val="72"/>
       <w:szCs w:val="72"/>
     </w:rPr>
+  </w:style>
+  <w:style w:type="table" w:styleId="TableNormal" w:default="1">
+    <w:name w:val="TableNormal"/>
+    <w:tblPr>
+      <w:tblCellMar>
+        <w:top w:w="100.0" w:type="dxa"/>
+        <w:left w:w="100.0" w:type="dxa"/>
+        <w:bottom w:w="100.0" w:type="dxa"/>
+        <w:right w:w="100.0" w:type="dxa"/>
+      </w:tblCellMar>
+    </w:tblPr>
+  </w:style>
+  <w:style w:type="paragraph" w:styleId="Normal" w:default="1">
+    <w:name w:val="normal"/>
   </w:style>
   <w:style w:type="paragraph" w:styleId="Subtitle">
     <w:name w:val="Subtitle"/>
@@ -6241,4 +6305,19 @@
   </a:objectDefaults>
   <a:extraClrSchemeLst/>
 </a:theme>
+</file>
+
+<file path=customXML/item1.xml><?xml version="1.0" encoding="utf-8"?>
+<go:gDocsCustomXmlDataStorage xmlns:go="http://customooxmlschemas.google.com/" xmlns:r="http://schemas.openxmlformats.org/officeDocument/2006/relationships" uri="GoogleDocsCustomDataVersion2">
+  <go:docsCustomData xmlns:go="http://customooxmlschemas.google.com/" roundtripDataSignature="AMtx7miKp+rfomJqOhE/flwqLczl/RMogA==">CgMxLjAaJAoBMBIfCh0IB0IZCgVBcmltbxIQQXJpYWwgVW5pY29kZSBNUzIOaC5pb3Y3b3A0d2Q3eTgyDmgudTI1cDJrMWl6NXA4Mg5oLjh1b3VlaTFhbDI0MDIOaC5sMzk0eHFvZ3FwaDQyDmguNjN2ZXZ6ZnRhNDRqMg5oLjUza2lobXNrbDZ2MDIOaC55NTU3OWdyZDloeHQ4AHIhMThPeE4wekl3VFFiUWVyWnljMGtaaGxJNlJWeGJvdXZL</go:docsCustomData>
+</go:gDocsCustomXmlDataStorage>
+</file>
+
+<file path=customXML/itemProps1.xml><?xml version="1.0" encoding="utf-8"?>
+<ds:datastoreItem xmlns:ds="http://schemas.openxmlformats.org/officeDocument/2006/customXml" ds:itemID="{11111111-1234-1234-1234-123412341234}">
+  <ds:schemaRefs>
+    <ds:schemaRef ds:uri="http://schemas.openxmlformats.org/officeDocument/2006/relationships"/>
+    <ds:schemaRef ds:uri="http://customooxmlschemas.google.com/"/>
+  </ds:schemaRefs>
+</ds:datastoreItem>
 </file>
</xml_diff>